<commit_message>
Update gameplay, matchmaking, README, and repack release artifacts
</commit_message>
<xml_diff>
--- a/DOCX/UDM_17.docx
+++ b/DOCX/UDM_17.docx
@@ -101,16 +101,16 @@
           <w:szCs w:val="28"/>
         </w:rPr>
         <w:drawing>
-          <wp:anchor distT="0" distB="0" distL="114300" distR="114300" simplePos="0" relativeHeight="251657216" behindDoc="0" locked="0" layoutInCell="1" allowOverlap="1" wp14:anchorId="0A4F3307" wp14:editId="4E4562E5">
+          <wp:anchor distT="0" distB="0" distL="114300" distR="114300" simplePos="0" relativeHeight="251657216" behindDoc="0" locked="0" layoutInCell="1" allowOverlap="1" wp14:anchorId="0A4F3307" wp14:editId="4BEAE199">
             <wp:simplePos x="0" y="0"/>
             <wp:positionH relativeFrom="column">
-              <wp:posOffset>1810385</wp:posOffset>
+              <wp:posOffset>1948180</wp:posOffset>
             </wp:positionH>
             <wp:positionV relativeFrom="paragraph">
-              <wp:posOffset>386080</wp:posOffset>
+              <wp:posOffset>421640</wp:posOffset>
             </wp:positionV>
-            <wp:extent cx="2436495" cy="572770"/>
-            <wp:effectExtent l="0" t="0" r="1905" b="0"/>
+            <wp:extent cx="2294890" cy="539115"/>
+            <wp:effectExtent l="0" t="0" r="0" b="0"/>
             <wp:wrapTopAndBottom/>
             <wp:docPr id="638059737" name="Picture 2"/>
             <wp:cNvGraphicFramePr>
@@ -138,7 +138,7 @@
                   <pic:spPr>
                     <a:xfrm>
                       <a:off x="0" y="0"/>
-                      <a:ext cx="2436495" cy="572770"/>
+                      <a:ext cx="2294890" cy="539115"/>
                     </a:xfrm>
                     <a:prstGeom prst="rect">
                       <a:avLst/>
@@ -296,6 +296,14 @@
         </w:rPr>
         <w:t xml:space="preserve"> </w:t>
       </w:r>
+      <w:r>
+        <w:rPr>
+          <w:rFonts w:cs="Times New Roman"/>
+          <w:b/>
+          <w:szCs w:val="26"/>
+        </w:rPr>
+        <w:t>MAI NGỌC CHÂU</w:t>
+      </w:r>
     </w:p>
     <w:p>
       <w:pPr>
@@ -324,6 +332,33 @@
           <w:szCs w:val="26"/>
         </w:rPr>
         <w:t xml:space="preserve"> </w:t>
+      </w:r>
+      <w:r>
+        <w:rPr>
+          <w:rFonts w:cs="Times New Roman"/>
+          <w:b/>
+          <w:bCs/>
+          <w:szCs w:val="26"/>
+        </w:rPr>
+        <w:t>[</w:t>
+      </w:r>
+      <w:r>
+        <w:rPr>
+          <w:rFonts w:cs="Times New Roman"/>
+          <w:b/>
+          <w:bCs/>
+          <w:szCs w:val="26"/>
+        </w:rPr>
+        <w:t>012012301305</w:t>
+      </w:r>
+      <w:r>
+        <w:rPr>
+          <w:rFonts w:cs="Times New Roman"/>
+          <w:b/>
+          <w:bCs/>
+          <w:szCs w:val="26"/>
+        </w:rPr>
+        <w:t>] – Lập trình mạng</w:t>
       </w:r>
       <w:r>
         <w:rPr>
@@ -425,6 +460,13 @@
                 <w:szCs w:val="26"/>
               </w:rPr>
             </w:pPr>
+            <w:r>
+              <w:rPr>
+                <w:rFonts w:cs="Times New Roman"/>
+                <w:szCs w:val="26"/>
+              </w:rPr>
+              <w:t>051206010768</w:t>
+            </w:r>
           </w:p>
         </w:tc>
         <w:tc>
@@ -567,6 +609,13 @@
                 <w:szCs w:val="26"/>
               </w:rPr>
             </w:pPr>
+            <w:r>
+              <w:rPr>
+                <w:rFonts w:cs="Times New Roman"/>
+                <w:szCs w:val="26"/>
+              </w:rPr>
+              <w:t>074206001772</w:t>
+            </w:r>
           </w:p>
         </w:tc>
         <w:tc>
@@ -630,6 +679,13 @@
                 <w:szCs w:val="26"/>
               </w:rPr>
             </w:pPr>
+            <w:r>
+              <w:rPr>
+                <w:rFonts w:cs="Times New Roman"/>
+                <w:szCs w:val="26"/>
+              </w:rPr>
+              <w:t>089205001024</w:t>
+            </w:r>
           </w:p>
         </w:tc>
         <w:tc>
@@ -693,6 +749,13 @@
                 <w:szCs w:val="26"/>
               </w:rPr>
             </w:pPr>
+            <w:r>
+              <w:rPr>
+                <w:rFonts w:cs="Times New Roman"/>
+                <w:szCs w:val="26"/>
+              </w:rPr>
+              <w:t>077306010278</w:t>
+            </w:r>
           </w:p>
         </w:tc>
         <w:tc>
@@ -756,6 +819,13 @@
                 <w:szCs w:val="26"/>
               </w:rPr>
             </w:pPr>
+            <w:r>
+              <w:rPr>
+                <w:rFonts w:cs="Times New Roman"/>
+                <w:szCs w:val="26"/>
+              </w:rPr>
+              <w:t>051206012557</w:t>
+            </w:r>
           </w:p>
         </w:tc>
         <w:tc>
@@ -886,7 +956,7 @@
           <w:color w:val="000000" w:themeColor="text1"/>
           <w:szCs w:val="26"/>
         </w:rPr>
-        <w:t>1</w:t>
+        <w:t>4</w:t>
       </w:r>
       <w:r>
         <w:rPr>
@@ -926,18 +996,17 @@
         </w:rPr>
       </w:pPr>
     </w:p>
-    <w:bookmarkStart w:id="0" w:name="_Toc224733373" w:displacedByCustomXml="next"/>
-    <w:bookmarkStart w:id="1" w:name="_Toc213759661" w:displacedByCustomXml="next"/>
     <w:sdt>
       <w:sdtPr>
         <w:rPr>
-          <w:rFonts w:eastAsiaTheme="minorHAnsi" w:cstheme="minorBidi"/>
-          <w:b w:val="0"/>
-          <w:caps w:val="0"/>
+          <w:rFonts w:ascii="Times New Roman" w:eastAsiaTheme="minorHAnsi" w:hAnsi="Times New Roman" w:cstheme="minorBidi"/>
+          <w:color w:val="auto"/>
+          <w:kern w:val="2"/>
           <w:sz w:val="26"/>
           <w:szCs w:val="22"/>
+          <w14:ligatures w14:val="standardContextual"/>
         </w:rPr>
-        <w:id w:val="897556615"/>
+        <w:id w:val="-27413740"/>
         <w:docPartObj>
           <w:docPartGallery w:val="Table of Contents"/>
           <w:docPartUnique/>
@@ -945,36 +1014,37 @@
       </w:sdtPr>
       <w:sdtEndPr>
         <w:rPr>
-          <w:rFonts w:cs="Times New Roman"/>
+          <w:b/>
+          <w:bCs/>
           <w:noProof/>
-          <w:szCs w:val="26"/>
         </w:rPr>
       </w:sdtEndPr>
       <w:sdtContent>
         <w:p>
           <w:pPr>
-            <w:pStyle w:val="Heading1"/>
-            <w:numPr>
-              <w:ilvl w:val="0"/>
-              <w:numId w:val="0"/>
-            </w:numPr>
-            <w:spacing w:before="0" w:after="0"/>
-            <w:ind w:left="568"/>
+            <w:pStyle w:val="TOCHeading"/>
+            <w:spacing w:line="480" w:lineRule="auto"/>
             <w:rPr>
-              <w:sz w:val="26"/>
-              <w:szCs w:val="26"/>
+              <w:rFonts w:ascii="Times New Roman" w:hAnsi="Times New Roman" w:cs="Times New Roman"/>
+              <w:b/>
+              <w:bCs/>
+              <w:color w:val="000000" w:themeColor="text1"/>
             </w:rPr>
           </w:pPr>
           <w:r>
-            <w:t>Mục lục</w:t>
+            <w:rPr>
+              <w:rFonts w:ascii="Times New Roman" w:hAnsi="Times New Roman" w:cs="Times New Roman"/>
+              <w:b/>
+              <w:bCs/>
+              <w:color w:val="000000" w:themeColor="text1"/>
+            </w:rPr>
+            <w:t>MỤC LỤC</w:t>
           </w:r>
-          <w:bookmarkEnd w:id="1"/>
-          <w:bookmarkEnd w:id="0"/>
         </w:p>
         <w:p>
           <w:pPr>
             <w:pStyle w:val="TOC1"/>
-            <w:spacing w:after="0"/>
+            <w:spacing w:line="480" w:lineRule="auto"/>
             <w:rPr>
               <w:rFonts w:asciiTheme="minorHAnsi" w:eastAsiaTheme="minorEastAsia" w:hAnsiTheme="minorHAnsi" w:cstheme="minorBidi"/>
               <w:b w:val="0"/>
@@ -985,29 +1055,20 @@
             </w:rPr>
           </w:pPr>
           <w:r>
-            <w:rPr>
-              <w:caps w:val="0"/>
-            </w:rPr>
             <w:fldChar w:fldCharType="begin"/>
           </w:r>
           <w:r>
-            <w:rPr>
-              <w:caps w:val="0"/>
-            </w:rPr>
             <w:instrText xml:space="preserve"> TOC \o "1-3" \h \z \u </w:instrText>
           </w:r>
           <w:r>
-            <w:rPr>
-              <w:caps w:val="0"/>
-            </w:rPr>
             <w:fldChar w:fldCharType="separate"/>
           </w:r>
-          <w:hyperlink w:anchor="_Toc224733373" w:history="1">
+          <w:hyperlink w:anchor="_Toc227180416" w:history="1">
             <w:r>
               <w:rPr>
                 <w:rStyle w:val="Hyperlink"/>
               </w:rPr>
-              <w:t>Mục lục</w:t>
+              <w:t>PHẦN 1: TỔNG QUAN</w:t>
             </w:r>
             <w:r>
               <w:rPr>
@@ -1025,7 +1086,7 @@
               <w:rPr>
                 <w:webHidden/>
               </w:rPr>
-              <w:instrText xml:space="preserve"> PAGEREF _Toc224733373 \h </w:instrText>
+              <w:instrText xml:space="preserve"> PAGEREF _Toc227180416 \h </w:instrText>
             </w:r>
             <w:r>
               <w:rPr>
@@ -1040,13 +1101,234 @@
             </w:r>
             <w:r>
               <w:rPr>
-                <w:caps w:val="0"/>
                 <w:webHidden/>
               </w:rPr>
-              <w:t>ii</w:t>
-            </w:r>
-            <w:r>
-              <w:rPr>
+              <w:t>1</w:t>
+            </w:r>
+            <w:r>
+              <w:rPr>
+                <w:webHidden/>
+              </w:rPr>
+              <w:fldChar w:fldCharType="end"/>
+            </w:r>
+          </w:hyperlink>
+        </w:p>
+        <w:p>
+          <w:pPr>
+            <w:pStyle w:val="TOC2"/>
+            <w:tabs>
+              <w:tab w:val="right" w:leader="dot" w:pos="9345"/>
+            </w:tabs>
+            <w:spacing w:line="480" w:lineRule="auto"/>
+            <w:rPr>
+              <w:rFonts w:asciiTheme="minorHAnsi" w:eastAsiaTheme="minorEastAsia" w:hAnsiTheme="minorHAnsi" w:cstheme="minorBidi"/>
+              <w:b w:val="0"/>
+              <w:bCs w:val="0"/>
+              <w:noProof/>
+              <w:sz w:val="24"/>
+              <w:szCs w:val="24"/>
+            </w:rPr>
+          </w:pPr>
+          <w:hyperlink w:anchor="_Toc227180417" w:history="1">
+            <w:r>
+              <w:rPr>
+                <w:rStyle w:val="Hyperlink"/>
+                <w:noProof/>
+              </w:rPr>
+              <w:t>1.1. Lý do chọn đề tài</w:t>
+            </w:r>
+            <w:r>
+              <w:rPr>
+                <w:noProof/>
+                <w:webHidden/>
+              </w:rPr>
+              <w:tab/>
+            </w:r>
+            <w:r>
+              <w:rPr>
+                <w:noProof/>
+                <w:webHidden/>
+              </w:rPr>
+              <w:fldChar w:fldCharType="begin"/>
+            </w:r>
+            <w:r>
+              <w:rPr>
+                <w:noProof/>
+                <w:webHidden/>
+              </w:rPr>
+              <w:instrText xml:space="preserve"> PAGEREF _Toc227180417 \h </w:instrText>
+            </w:r>
+            <w:r>
+              <w:rPr>
+                <w:noProof/>
+                <w:webHidden/>
+              </w:rPr>
+            </w:r>
+            <w:r>
+              <w:rPr>
+                <w:noProof/>
+                <w:webHidden/>
+              </w:rPr>
+              <w:fldChar w:fldCharType="separate"/>
+            </w:r>
+            <w:r>
+              <w:rPr>
+                <w:noProof/>
+                <w:webHidden/>
+              </w:rPr>
+              <w:t>1</w:t>
+            </w:r>
+            <w:r>
+              <w:rPr>
+                <w:noProof/>
+                <w:webHidden/>
+              </w:rPr>
+              <w:fldChar w:fldCharType="end"/>
+            </w:r>
+          </w:hyperlink>
+        </w:p>
+        <w:p>
+          <w:pPr>
+            <w:pStyle w:val="TOC2"/>
+            <w:tabs>
+              <w:tab w:val="right" w:leader="dot" w:pos="9345"/>
+            </w:tabs>
+            <w:spacing w:line="480" w:lineRule="auto"/>
+            <w:rPr>
+              <w:rFonts w:asciiTheme="minorHAnsi" w:eastAsiaTheme="minorEastAsia" w:hAnsiTheme="minorHAnsi" w:cstheme="minorBidi"/>
+              <w:b w:val="0"/>
+              <w:bCs w:val="0"/>
+              <w:noProof/>
+              <w:sz w:val="24"/>
+              <w:szCs w:val="24"/>
+            </w:rPr>
+          </w:pPr>
+          <w:hyperlink w:anchor="_Toc227180418" w:history="1">
+            <w:r>
+              <w:rPr>
+                <w:rStyle w:val="Hyperlink"/>
+                <w:noProof/>
+              </w:rPr>
+              <w:t>1.2. Việc thực hiện dự án này hướng tới các mục tiêu cụ thể sau:</w:t>
+            </w:r>
+            <w:r>
+              <w:rPr>
+                <w:noProof/>
+                <w:webHidden/>
+              </w:rPr>
+              <w:tab/>
+            </w:r>
+            <w:r>
+              <w:rPr>
+                <w:noProof/>
+                <w:webHidden/>
+              </w:rPr>
+              <w:fldChar w:fldCharType="begin"/>
+            </w:r>
+            <w:r>
+              <w:rPr>
+                <w:noProof/>
+                <w:webHidden/>
+              </w:rPr>
+              <w:instrText xml:space="preserve"> PAGEREF _Toc227180418 \h </w:instrText>
+            </w:r>
+            <w:r>
+              <w:rPr>
+                <w:noProof/>
+                <w:webHidden/>
+              </w:rPr>
+            </w:r>
+            <w:r>
+              <w:rPr>
+                <w:noProof/>
+                <w:webHidden/>
+              </w:rPr>
+              <w:fldChar w:fldCharType="separate"/>
+            </w:r>
+            <w:r>
+              <w:rPr>
+                <w:noProof/>
+                <w:webHidden/>
+              </w:rPr>
+              <w:t>1</w:t>
+            </w:r>
+            <w:r>
+              <w:rPr>
+                <w:noProof/>
+                <w:webHidden/>
+              </w:rPr>
+              <w:fldChar w:fldCharType="end"/>
+            </w:r>
+          </w:hyperlink>
+        </w:p>
+        <w:p>
+          <w:pPr>
+            <w:pStyle w:val="TOC2"/>
+            <w:tabs>
+              <w:tab w:val="right" w:leader="dot" w:pos="9345"/>
+            </w:tabs>
+            <w:spacing w:line="480" w:lineRule="auto"/>
+            <w:rPr>
+              <w:rFonts w:asciiTheme="minorHAnsi" w:eastAsiaTheme="minorEastAsia" w:hAnsiTheme="minorHAnsi" w:cstheme="minorBidi"/>
+              <w:b w:val="0"/>
+              <w:bCs w:val="0"/>
+              <w:noProof/>
+              <w:sz w:val="24"/>
+              <w:szCs w:val="24"/>
+            </w:rPr>
+          </w:pPr>
+          <w:hyperlink w:anchor="_Toc227180419" w:history="1">
+            <w:r>
+              <w:rPr>
+                <w:rStyle w:val="Hyperlink"/>
+                <w:noProof/>
+              </w:rPr>
+              <w:t>1.3. Cơ sở lý thuyết áp dụng</w:t>
+            </w:r>
+            <w:r>
+              <w:rPr>
+                <w:noProof/>
+                <w:webHidden/>
+              </w:rPr>
+              <w:tab/>
+            </w:r>
+            <w:r>
+              <w:rPr>
+                <w:noProof/>
+                <w:webHidden/>
+              </w:rPr>
+              <w:fldChar w:fldCharType="begin"/>
+            </w:r>
+            <w:r>
+              <w:rPr>
+                <w:noProof/>
+                <w:webHidden/>
+              </w:rPr>
+              <w:instrText xml:space="preserve"> PAGEREF _Toc227180419 \h </w:instrText>
+            </w:r>
+            <w:r>
+              <w:rPr>
+                <w:noProof/>
+                <w:webHidden/>
+              </w:rPr>
+            </w:r>
+            <w:r>
+              <w:rPr>
+                <w:noProof/>
+                <w:webHidden/>
+              </w:rPr>
+              <w:fldChar w:fldCharType="separate"/>
+            </w:r>
+            <w:r>
+              <w:rPr>
+                <w:noProof/>
+                <w:webHidden/>
+              </w:rPr>
+              <w:t>1</w:t>
+            </w:r>
+            <w:r>
+              <w:rPr>
+                <w:noProof/>
                 <w:webHidden/>
               </w:rPr>
               <w:fldChar w:fldCharType="end"/>
@@ -1056,7 +1338,7 @@
         <w:p>
           <w:pPr>
             <w:pStyle w:val="TOC1"/>
-            <w:spacing w:after="0"/>
+            <w:spacing w:line="480" w:lineRule="auto"/>
             <w:rPr>
               <w:rFonts w:asciiTheme="minorHAnsi" w:eastAsiaTheme="minorEastAsia" w:hAnsiTheme="minorHAnsi" w:cstheme="minorBidi"/>
               <w:b w:val="0"/>
@@ -1066,12 +1348,12 @@
               <w:szCs w:val="24"/>
             </w:rPr>
           </w:pPr>
-          <w:hyperlink w:anchor="_Toc224733374" w:history="1">
+          <w:hyperlink w:anchor="_Toc227180420" w:history="1">
             <w:r>
               <w:rPr>
                 <w:rStyle w:val="Hyperlink"/>
               </w:rPr>
-              <w:t>PHẦN 1: TỔNG QUAN</w:t>
+              <w:t>PHẦN 2: THÀNH TỰU</w:t>
             </w:r>
             <w:r>
               <w:rPr>
@@ -1089,7 +1371,7 @@
               <w:rPr>
                 <w:webHidden/>
               </w:rPr>
-              <w:instrText xml:space="preserve"> PAGEREF _Toc224733374 \h </w:instrText>
+              <w:instrText xml:space="preserve"> PAGEREF _Toc227180420 \h </w:instrText>
             </w:r>
             <w:r>
               <w:rPr>
@@ -1106,7 +1388,7 @@
               <w:rPr>
                 <w:webHidden/>
               </w:rPr>
-              <w:t>1</w:t>
+              <w:t>2</w:t>
             </w:r>
             <w:r>
               <w:rPr>
@@ -1122,7 +1404,7 @@
             <w:tabs>
               <w:tab w:val="right" w:leader="dot" w:pos="9345"/>
             </w:tabs>
-            <w:spacing w:before="0"/>
+            <w:spacing w:line="480" w:lineRule="auto"/>
             <w:rPr>
               <w:rFonts w:asciiTheme="minorHAnsi" w:eastAsiaTheme="minorEastAsia" w:hAnsiTheme="minorHAnsi" w:cstheme="minorBidi"/>
               <w:b w:val="0"/>
@@ -1132,13 +1414,13 @@
               <w:szCs w:val="24"/>
             </w:rPr>
           </w:pPr>
-          <w:hyperlink w:anchor="_Toc224733375" w:history="1">
+          <w:hyperlink w:anchor="_Toc227180421" w:history="1">
             <w:r>
               <w:rPr>
                 <w:rStyle w:val="Hyperlink"/>
                 <w:noProof/>
               </w:rPr>
-              <w:t>1.1. Lý do chọn đề tài</w:t>
+              <w:t>2.1. Những khó khăn gặp phải</w:t>
             </w:r>
             <w:r>
               <w:rPr>
@@ -1159,7 +1441,7 @@
                 <w:noProof/>
                 <w:webHidden/>
               </w:rPr>
-              <w:instrText xml:space="preserve"> PAGEREF _Toc224733375 \h </w:instrText>
+              <w:instrText xml:space="preserve"> PAGEREF _Toc227180421 \h </w:instrText>
             </w:r>
             <w:r>
               <w:rPr>
@@ -1179,7 +1461,7 @@
                 <w:noProof/>
                 <w:webHidden/>
               </w:rPr>
-              <w:t>1</w:t>
+              <w:t>2</w:t>
             </w:r>
             <w:r>
               <w:rPr>
@@ -1196,7 +1478,7 @@
             <w:tabs>
               <w:tab w:val="right" w:leader="dot" w:pos="9345"/>
             </w:tabs>
-            <w:spacing w:before="0"/>
+            <w:spacing w:line="480" w:lineRule="auto"/>
             <w:rPr>
               <w:rFonts w:asciiTheme="minorHAnsi" w:eastAsiaTheme="minorEastAsia" w:hAnsiTheme="minorHAnsi" w:cstheme="minorBidi"/>
               <w:b w:val="0"/>
@@ -1206,13 +1488,13 @@
               <w:szCs w:val="24"/>
             </w:rPr>
           </w:pPr>
-          <w:hyperlink w:anchor="_Toc224733376" w:history="1">
+          <w:hyperlink w:anchor="_Toc227180422" w:history="1">
             <w:r>
               <w:rPr>
                 <w:rStyle w:val="Hyperlink"/>
                 <w:noProof/>
               </w:rPr>
-              <w:t>1.2. Việc thực hiện dự án này hướng tới các mục tiêu cụ thể sau:</w:t>
+              <w:t>2.2. Những điều cần học hỏi và cải thiện:</w:t>
             </w:r>
             <w:r>
               <w:rPr>
@@ -1233,7 +1515,7 @@
                 <w:noProof/>
                 <w:webHidden/>
               </w:rPr>
-              <w:instrText xml:space="preserve"> PAGEREF _Toc224733376 \h </w:instrText>
+              <w:instrText xml:space="preserve"> PAGEREF _Toc227180422 \h </w:instrText>
             </w:r>
             <w:r>
               <w:rPr>
@@ -1253,7 +1535,7 @@
                 <w:noProof/>
                 <w:webHidden/>
               </w:rPr>
-              <w:t>1</w:t>
+              <w:t>3</w:t>
             </w:r>
             <w:r>
               <w:rPr>
@@ -1270,7 +1552,7 @@
             <w:tabs>
               <w:tab w:val="right" w:leader="dot" w:pos="9345"/>
             </w:tabs>
-            <w:spacing w:before="0"/>
+            <w:spacing w:line="480" w:lineRule="auto"/>
             <w:rPr>
               <w:rFonts w:asciiTheme="minorHAnsi" w:eastAsiaTheme="minorEastAsia" w:hAnsiTheme="minorHAnsi" w:cstheme="minorBidi"/>
               <w:b w:val="0"/>
@@ -1280,13 +1562,13 @@
               <w:szCs w:val="24"/>
             </w:rPr>
           </w:pPr>
-          <w:hyperlink w:anchor="_Toc224733377" w:history="1">
+          <w:hyperlink w:anchor="_Toc227180423" w:history="1">
             <w:r>
               <w:rPr>
                 <w:rStyle w:val="Hyperlink"/>
                 <w:noProof/>
               </w:rPr>
-              <w:t>1.3. Cơ sở lý thuyết áp dụng</w:t>
+              <w:t>2.3. Những gì đã làm được</w:t>
             </w:r>
             <w:r>
               <w:rPr>
@@ -1307,7 +1589,7 @@
                 <w:noProof/>
                 <w:webHidden/>
               </w:rPr>
-              <w:instrText xml:space="preserve"> PAGEREF _Toc224733377 \h </w:instrText>
+              <w:instrText xml:space="preserve"> PAGEREF _Toc227180423 \h </w:instrText>
             </w:r>
             <w:r>
               <w:rPr>
@@ -1327,7 +1609,7 @@
                 <w:noProof/>
                 <w:webHidden/>
               </w:rPr>
-              <w:t>1</w:t>
+              <w:t>3</w:t>
             </w:r>
             <w:r>
               <w:rPr>
@@ -1340,18 +1622,382 @@
         </w:p>
         <w:p>
           <w:pPr>
-            <w:spacing w:before="0" w:after="0"/>
+            <w:pStyle w:val="TOC2"/>
+            <w:tabs>
+              <w:tab w:val="right" w:leader="dot" w:pos="9345"/>
+            </w:tabs>
+            <w:spacing w:line="480" w:lineRule="auto"/>
             <w:rPr>
-              <w:rFonts w:cs="Times New Roman"/>
-              <w:szCs w:val="26"/>
+              <w:rFonts w:asciiTheme="minorHAnsi" w:eastAsiaTheme="minorEastAsia" w:hAnsiTheme="minorHAnsi" w:cstheme="minorBidi"/>
+              <w:b w:val="0"/>
+              <w:bCs w:val="0"/>
+              <w:noProof/>
+              <w:sz w:val="24"/>
+              <w:szCs w:val="24"/>
             </w:rPr>
+          </w:pPr>
+          <w:hyperlink w:anchor="_Toc227180424" w:history="1">
+            <w:r>
+              <w:rPr>
+                <w:rStyle w:val="Hyperlink"/>
+                <w:rFonts w:eastAsia="Times New Roman" w:cs="Times New Roman"/>
+                <w:noProof/>
+                <w:kern w:val="0"/>
+                <w14:ligatures w14:val="none"/>
+              </w:rPr>
+              <w:t>2.4.</w:t>
+            </w:r>
+            <w:r>
+              <w:rPr>
+                <w:rStyle w:val="Hyperlink"/>
+                <w:noProof/>
+              </w:rPr>
+              <w:t xml:space="preserve"> Những gì chưa làm được:</w:t>
+            </w:r>
+            <w:r>
+              <w:rPr>
+                <w:noProof/>
+                <w:webHidden/>
+              </w:rPr>
+              <w:tab/>
+            </w:r>
+            <w:r>
+              <w:rPr>
+                <w:noProof/>
+                <w:webHidden/>
+              </w:rPr>
+              <w:fldChar w:fldCharType="begin"/>
+            </w:r>
+            <w:r>
+              <w:rPr>
+                <w:noProof/>
+                <w:webHidden/>
+              </w:rPr>
+              <w:instrText xml:space="preserve"> PAGEREF _Toc227180424 \h </w:instrText>
+            </w:r>
+            <w:r>
+              <w:rPr>
+                <w:noProof/>
+                <w:webHidden/>
+              </w:rPr>
+            </w:r>
+            <w:r>
+              <w:rPr>
+                <w:noProof/>
+                <w:webHidden/>
+              </w:rPr>
+              <w:fldChar w:fldCharType="separate"/>
+            </w:r>
+            <w:r>
+              <w:rPr>
+                <w:noProof/>
+                <w:webHidden/>
+              </w:rPr>
+              <w:t>4</w:t>
+            </w:r>
+            <w:r>
+              <w:rPr>
+                <w:noProof/>
+                <w:webHidden/>
+              </w:rPr>
+              <w:fldChar w:fldCharType="end"/>
+            </w:r>
+          </w:hyperlink>
+        </w:p>
+        <w:p>
+          <w:pPr>
+            <w:pStyle w:val="TOC2"/>
+            <w:tabs>
+              <w:tab w:val="right" w:leader="dot" w:pos="9345"/>
+            </w:tabs>
+            <w:spacing w:line="480" w:lineRule="auto"/>
+            <w:rPr>
+              <w:rFonts w:asciiTheme="minorHAnsi" w:eastAsiaTheme="minorEastAsia" w:hAnsiTheme="minorHAnsi" w:cstheme="minorBidi"/>
+              <w:b w:val="0"/>
+              <w:bCs w:val="0"/>
+              <w:noProof/>
+              <w:sz w:val="24"/>
+              <w:szCs w:val="24"/>
+            </w:rPr>
+          </w:pPr>
+          <w:hyperlink w:anchor="_Toc227180425" w:history="1">
+            <w:r>
+              <w:rPr>
+                <w:rStyle w:val="Hyperlink"/>
+                <w:noProof/>
+              </w:rPr>
+              <w:t>2.5. Kinh nghiệm rút ra trong quá trình thực hiện</w:t>
+            </w:r>
+            <w:r>
+              <w:rPr>
+                <w:noProof/>
+                <w:webHidden/>
+              </w:rPr>
+              <w:tab/>
+            </w:r>
+            <w:r>
+              <w:rPr>
+                <w:noProof/>
+                <w:webHidden/>
+              </w:rPr>
+              <w:fldChar w:fldCharType="begin"/>
+            </w:r>
+            <w:r>
+              <w:rPr>
+                <w:noProof/>
+                <w:webHidden/>
+              </w:rPr>
+              <w:instrText xml:space="preserve"> PAGEREF _Toc227180425 \h </w:instrText>
+            </w:r>
+            <w:r>
+              <w:rPr>
+                <w:noProof/>
+                <w:webHidden/>
+              </w:rPr>
+            </w:r>
+            <w:r>
+              <w:rPr>
+                <w:noProof/>
+                <w:webHidden/>
+              </w:rPr>
+              <w:fldChar w:fldCharType="separate"/>
+            </w:r>
+            <w:r>
+              <w:rPr>
+                <w:noProof/>
+                <w:webHidden/>
+              </w:rPr>
+              <w:t>4</w:t>
+            </w:r>
+            <w:r>
+              <w:rPr>
+                <w:noProof/>
+                <w:webHidden/>
+              </w:rPr>
+              <w:fldChar w:fldCharType="end"/>
+            </w:r>
+          </w:hyperlink>
+        </w:p>
+        <w:p>
+          <w:pPr>
+            <w:pStyle w:val="TOC2"/>
+            <w:tabs>
+              <w:tab w:val="right" w:leader="dot" w:pos="9345"/>
+            </w:tabs>
+            <w:spacing w:line="480" w:lineRule="auto"/>
+            <w:rPr>
+              <w:rFonts w:asciiTheme="minorHAnsi" w:eastAsiaTheme="minorEastAsia" w:hAnsiTheme="minorHAnsi" w:cstheme="minorBidi"/>
+              <w:b w:val="0"/>
+              <w:bCs w:val="0"/>
+              <w:noProof/>
+              <w:sz w:val="24"/>
+              <w:szCs w:val="24"/>
+            </w:rPr>
+          </w:pPr>
+          <w:hyperlink w:anchor="_Toc227180426" w:history="1">
+            <w:r>
+              <w:rPr>
+                <w:rStyle w:val="Hyperlink"/>
+                <w:noProof/>
+              </w:rPr>
+              <w:t>2.6. Mức độ hoàn thành và đánh giá kết quả</w:t>
+            </w:r>
+            <w:r>
+              <w:rPr>
+                <w:noProof/>
+                <w:webHidden/>
+              </w:rPr>
+              <w:tab/>
+            </w:r>
+            <w:r>
+              <w:rPr>
+                <w:noProof/>
+                <w:webHidden/>
+              </w:rPr>
+              <w:fldChar w:fldCharType="begin"/>
+            </w:r>
+            <w:r>
+              <w:rPr>
+                <w:noProof/>
+                <w:webHidden/>
+              </w:rPr>
+              <w:instrText xml:space="preserve"> PAGEREF _Toc227180426 \h </w:instrText>
+            </w:r>
+            <w:r>
+              <w:rPr>
+                <w:noProof/>
+                <w:webHidden/>
+              </w:rPr>
+            </w:r>
+            <w:r>
+              <w:rPr>
+                <w:noProof/>
+                <w:webHidden/>
+              </w:rPr>
+              <w:fldChar w:fldCharType="separate"/>
+            </w:r>
+            <w:r>
+              <w:rPr>
+                <w:noProof/>
+                <w:webHidden/>
+              </w:rPr>
+              <w:t>4</w:t>
+            </w:r>
+            <w:r>
+              <w:rPr>
+                <w:noProof/>
+                <w:webHidden/>
+              </w:rPr>
+              <w:fldChar w:fldCharType="end"/>
+            </w:r>
+          </w:hyperlink>
+        </w:p>
+        <w:p>
+          <w:pPr>
+            <w:pStyle w:val="TOC2"/>
+            <w:tabs>
+              <w:tab w:val="right" w:leader="dot" w:pos="9345"/>
+            </w:tabs>
+            <w:spacing w:line="600" w:lineRule="auto"/>
+            <w:rPr>
+              <w:rFonts w:asciiTheme="minorHAnsi" w:eastAsiaTheme="minorEastAsia" w:hAnsiTheme="minorHAnsi" w:cstheme="minorBidi"/>
+              <w:b w:val="0"/>
+              <w:bCs w:val="0"/>
+              <w:noProof/>
+              <w:sz w:val="24"/>
+              <w:szCs w:val="24"/>
+            </w:rPr>
+          </w:pPr>
+          <w:hyperlink w:anchor="_Toc227180427" w:history="1">
+            <w:r>
+              <w:rPr>
+                <w:rStyle w:val="Hyperlink"/>
+                <w:noProof/>
+              </w:rPr>
+              <w:t>2.7. Công nghệ và kỹ thuật nổi bật đã áp dụng</w:t>
+            </w:r>
+            <w:r>
+              <w:rPr>
+                <w:noProof/>
+                <w:webHidden/>
+              </w:rPr>
+              <w:tab/>
+            </w:r>
+            <w:r>
+              <w:rPr>
+                <w:noProof/>
+                <w:webHidden/>
+              </w:rPr>
+              <w:fldChar w:fldCharType="begin"/>
+            </w:r>
+            <w:r>
+              <w:rPr>
+                <w:noProof/>
+                <w:webHidden/>
+              </w:rPr>
+              <w:instrText xml:space="preserve"> PAGEREF _Toc227180427 \h </w:instrText>
+            </w:r>
+            <w:r>
+              <w:rPr>
+                <w:noProof/>
+                <w:webHidden/>
+              </w:rPr>
+            </w:r>
+            <w:r>
+              <w:rPr>
+                <w:noProof/>
+                <w:webHidden/>
+              </w:rPr>
+              <w:fldChar w:fldCharType="separate"/>
+            </w:r>
+            <w:r>
+              <w:rPr>
+                <w:noProof/>
+                <w:webHidden/>
+              </w:rPr>
+              <w:t>5</w:t>
+            </w:r>
+            <w:r>
+              <w:rPr>
+                <w:noProof/>
+                <w:webHidden/>
+              </w:rPr>
+              <w:fldChar w:fldCharType="end"/>
+            </w:r>
+          </w:hyperlink>
+        </w:p>
+        <w:p>
+          <w:pPr>
+            <w:pStyle w:val="TOC1"/>
+            <w:spacing w:line="600" w:lineRule="auto"/>
+            <w:rPr>
+              <w:rFonts w:asciiTheme="minorHAnsi" w:eastAsiaTheme="minorEastAsia" w:hAnsiTheme="minorHAnsi" w:cstheme="minorBidi"/>
+              <w:b w:val="0"/>
+              <w:bCs w:val="0"/>
+              <w:caps w:val="0"/>
+              <w:sz w:val="24"/>
+              <w:szCs w:val="24"/>
+            </w:rPr>
+          </w:pPr>
+          <w:hyperlink w:anchor="_Toc227180428" w:history="1">
+            <w:r>
+              <w:rPr>
+                <w:rStyle w:val="Hyperlink"/>
+              </w:rPr>
+              <w:t>PHẦN 3: KẾT LUẬN</w:t>
+            </w:r>
+            <w:r>
+              <w:rPr>
+                <w:webHidden/>
+              </w:rPr>
+              <w:tab/>
+            </w:r>
+            <w:r>
+              <w:rPr>
+                <w:webHidden/>
+              </w:rPr>
+              <w:fldChar w:fldCharType="begin"/>
+            </w:r>
+            <w:r>
+              <w:rPr>
+                <w:webHidden/>
+              </w:rPr>
+              <w:instrText xml:space="preserve"> PAGEREF _Toc227180428 \h </w:instrText>
+            </w:r>
+            <w:r>
+              <w:rPr>
+                <w:webHidden/>
+              </w:rPr>
+            </w:r>
+            <w:r>
+              <w:rPr>
+                <w:webHidden/>
+              </w:rPr>
+              <w:fldChar w:fldCharType="separate"/>
+            </w:r>
+            <w:r>
+              <w:rPr>
+                <w:webHidden/>
+              </w:rPr>
+              <w:t>6</w:t>
+            </w:r>
+            <w:r>
+              <w:rPr>
+                <w:webHidden/>
+              </w:rPr>
+              <w:fldChar w:fldCharType="end"/>
+            </w:r>
+          </w:hyperlink>
+        </w:p>
+        <w:p>
+          <w:pPr>
+            <w:spacing w:line="480" w:lineRule="auto"/>
           </w:pPr>
           <w:r>
             <w:rPr>
-              <w:rFonts w:cs="Times New Roman"/>
-              <w:caps/>
+              <w:b/>
+              <w:bCs/>
               <w:noProof/>
-              <w:szCs w:val="26"/>
             </w:rPr>
             <w:fldChar w:fldCharType="end"/>
           </w:r>
@@ -1380,186 +2026,623 @@
       <w:pPr>
         <w:pStyle w:val="Heading1"/>
       </w:pPr>
-      <w:bookmarkStart w:id="2" w:name="_Toc224733374"/>
+      <w:bookmarkStart w:id="0" w:name="_Toc227180416"/>
       <w:r>
         <w:lastRenderedPageBreak/>
         <w:t>TỔNG QUAN</w:t>
+      </w:r>
+      <w:bookmarkEnd w:id="0"/>
+    </w:p>
+    <w:p>
+      <w:pPr>
+        <w:pStyle w:val="Heading2"/>
+      </w:pPr>
+      <w:bookmarkStart w:id="1" w:name="_Toc227180417"/>
+      <w:r>
+        <w:t>Lý do chọn đề tài</w:t>
+      </w:r>
+      <w:bookmarkEnd w:id="1"/>
+    </w:p>
+    <w:p>
+      <w:r>
+        <w:tab/>
+        <w:t>Trong thời đại công nghệ số hiện nay, các ứng dụng có khả năng kết nối và tương tác theo thời gian thực (real</w:t>
+      </w:r>
+      <w:r>
+        <w:t>-</w:t>
+      </w:r>
+      <w:r>
+        <w:t xml:space="preserve">time) đóng vai trò vô cùng quan trọng. Để hiểu rõ cốt lõi của việc truyền tải dữ liệu qua mạng, việc tự tay xây dựng một hệ thống Client </w:t>
+      </w:r>
+      <w:r>
+        <w:t>-</w:t>
+      </w:r>
+      <w:r>
+        <w:t xml:space="preserve"> Server từ đầu là phương pháp học tập hiệu quả nhất.</w:t>
+      </w:r>
+    </w:p>
+    <w:p>
+      <w:r>
+        <w:tab/>
+        <w:t xml:space="preserve">Nhóm quyết định chọn đề tài </w:t>
+      </w:r>
+      <w:r>
+        <w:t>“</w:t>
+      </w:r>
+      <w:r>
+        <w:t>Xây dựng Game Cờ Caro (UDM_17)</w:t>
+      </w:r>
+      <w:r>
+        <w:t>”</w:t>
+      </w:r>
+      <w:r>
+        <w:t xml:space="preserve"> vì đây là một bài toán kinh điển nhưng mang lại giá trị thực tiễn cao. Cờ Caro là một trò chơi đối kháng quen thuộc, có luật chơi đơn giản, giúp nhóm không bị sa đà quá nhiều vào logic game mà có thể tập trung tối đa vào việc giải quyết các thách thức của bộ môn Lập trình mạng. Đề tài này đặt ra những bài toán thực tế cần giải quyết như: làm sao để Server định tuyến chính xác thông điệp giữa các cặp người chơi khác nhau, làm sao để xử lý đồng thời nhiều kết nối mà không bị nghẽn hệ thống, và cách đồng bộ hóa giao diện người dùng</w:t>
+      </w:r>
+      <w:r>
+        <w:t xml:space="preserve"> </w:t>
+      </w:r>
+      <w:r>
+        <w:t>với các luồng dữ liệu mạng.</w:t>
+      </w:r>
+    </w:p>
+    <w:p>
+      <w:pPr>
+        <w:pStyle w:val="Heading2"/>
+      </w:pPr>
+      <w:bookmarkStart w:id="2" w:name="_Toc227180418"/>
+      <w:r>
+        <w:t>Việc thực hiện dự án này hướng tới các mục tiêu cụ thể sau:</w:t>
       </w:r>
       <w:bookmarkEnd w:id="2"/>
     </w:p>
     <w:p>
-      <w:pPr>
-        <w:pStyle w:val="Heading2"/>
-      </w:pPr>
-      <w:bookmarkStart w:id="3" w:name="_Toc224733375"/>
-      <w:r>
-        <w:t>Lý do chọn đề tài</w:t>
-      </w:r>
-      <w:bookmarkEnd w:id="3"/>
+      <w:r>
+        <w:t>Về mặt kiến thức: Ứng dụng thành thạo các kiến thức đã học trong môn học, đặc biệt là lập trình giao tiếp mạng bằng TCP Socket, quản lý đa luồng (Multi</w:t>
+      </w:r>
+      <w:r>
+        <w:t>-</w:t>
+      </w:r>
+      <w:r>
+        <w:t>threading) và lập trình giao diện WinForms bằng C#.</w:t>
+      </w:r>
     </w:p>
     <w:p>
       <w:r>
-        <w:tab/>
-      </w:r>
-      <w:r>
-        <w:t>Trong thời đại công nghệ số hiện nay, các ứng dụng có khả năng kết nối và tương tác theo thời gian thực (real</w:t>
-      </w:r>
-      <w:r>
-        <w:t>-</w:t>
-      </w:r>
-      <w:r>
-        <w:t xml:space="preserve">time) đóng vai trò vô cùng quan trọng. Để hiểu rõ cốt lõi của việc truyền tải dữ liệu qua mạng, việc tự tay xây dựng một hệ thống Client </w:t>
-      </w:r>
-      <w:r>
-        <w:t>-</w:t>
-      </w:r>
-      <w:r>
-        <w:t xml:space="preserve"> Server từ đầu là phương pháp học tập hiệu quả nhất.</w:t>
+        <w:t>Về mặt kỹ năng: Rèn luyện kỹ năng phân tích thiết kế hệ thống, xây dựng giao thức truyền tin riêng biệt giữa Client và Server, cũng như kỹ năng xử lý luồng dữ liệu, đọc/ghi file lưu trữ lịch sử thi đấu.</w:t>
       </w:r>
     </w:p>
     <w:p>
       <w:r>
-        <w:tab/>
-      </w:r>
-      <w:r>
-        <w:t xml:space="preserve">Nhóm quyết định chọn đề tài </w:t>
-      </w:r>
-      <w:r>
-        <w:t>“</w:t>
-      </w:r>
-      <w:r>
-        <w:t>Xây dựng Game Cờ Caro (UDM_17)</w:t>
-      </w:r>
-      <w:r>
-        <w:t>”</w:t>
-      </w:r>
-      <w:r>
-        <w:t xml:space="preserve"> vì đây là một bài toán kinh điển nhưng mang lại giá trị thực tiễn cao. Cờ Caro là một trò chơi đối kháng quen thuộc, có luật chơi đơn giản, giúp nhóm không bị sa đà quá nhiều vào logic game mà có thể tập trung tối đa vào việc giải quyết các thách thức của bộ môn Lập trình mạng. Đề tài này đặt ra những bài toán thực tế cần giải quyết như: làm sao để Server định tuyến chính xác thông điệp giữa các cặp người chơi khác nhau, làm sao để xử lý đồng thời nhiều kết nối mà không bị nghẽn hệ thống, và cách đồng bộ hóa giao diện người dùng</w:t>
-      </w:r>
-      <w:r>
-        <w:t xml:space="preserve"> </w:t>
-      </w:r>
-      <w:r>
-        <w:t>với các luồng dữ liệu mạng.</w:t>
+        <w:t>Về mặt sản phẩm: Tạo ra một phần mềm hoàn chỉnh, có giao diện trực quan, thân thiện, cho phép nhiều cặp người chơi có thể kết nối đến một máy chủ trung tâm để thách đấu, chơi cờ, tính giờ và lưu lại kết quả một cách chính xác, ổn định.</w:t>
       </w:r>
     </w:p>
     <w:p>
       <w:pPr>
         <w:pStyle w:val="Heading2"/>
       </w:pPr>
-      <w:bookmarkStart w:id="4" w:name="_Toc224733376"/>
-      <w:r>
-        <w:t>Việc thực hiện dự án này hướng tới các mục tiêu cụ thể sau:</w:t>
+      <w:bookmarkStart w:id="3" w:name="_Toc227180419"/>
+      <w:r>
+        <w:t>Cơ sở lý thuyết áp dụng</w:t>
+      </w:r>
+      <w:bookmarkEnd w:id="3"/>
+      <w:r>
+        <w:t xml:space="preserve"> </w:t>
+      </w:r>
+    </w:p>
+    <w:p>
+      <w:r>
+        <w:t>Để hiện thực hóa hệ thống, dự án được xây dựng dựa trên các nền tảng lý thuyết cốt lõi sau:</w:t>
+      </w:r>
+    </w:p>
+    <w:p>
+      <w:r>
+        <w:lastRenderedPageBreak/>
+        <w:t xml:space="preserve">Mô hình Client </w:t>
+      </w:r>
+      <w:r>
+        <w:t>-</w:t>
+      </w:r>
+      <w:r>
+        <w:t xml:space="preserve"> Server: Là mô hình kiến trúc mạng trong đó Server đóng vai trò trung tâm, lắng nghe các yêu cầu kết nối, quản lý danh sách người dùng và điều phối dữ liệu. Các Clients là những trạm trạm cuối, kết nối đến Server để gửi yêu cầu (thách đấu, đánh cờ) và nhận kết quả trả về.</w:t>
+      </w:r>
+    </w:p>
+    <w:p>
+      <w:r>
+        <w:t>Giao thức TCP/IP</w:t>
+      </w:r>
+      <w:r>
+        <w:t xml:space="preserve">: </w:t>
+      </w:r>
+      <w:r>
+        <w:t>Dự án sử dụng TCP thay vì UDP để đảm bảo tính toàn vẹn của dữ liệu. Cờ Caro đòi hỏi tính chính xác tuyệt đối; mỗi nước đi</w:t>
+      </w:r>
+      <w:r>
+        <w:t xml:space="preserve"> </w:t>
+      </w:r>
+      <w:r>
+        <w:t>cần được truyền đi một cách an toàn, đúng thứ tự và không bị thất thoát trên đường truyền.</w:t>
+      </w:r>
+    </w:p>
+    <w:p>
+      <w:r>
+        <w:t>Lập trình Socket trong C#: Sử dụng các lớp TcpListener và TcpClient</w:t>
+      </w:r>
+      <w:r>
+        <w:t xml:space="preserve">. </w:t>
+      </w:r>
+      <w:r>
+        <w:t>Dữ liệu được trao đổi qua lại thông qua đối tượng NetworkStream dưới dạng các mảng byte.</w:t>
+      </w:r>
+    </w:p>
+    <w:p>
+      <w:r>
+        <w:t>Xử lý Đa luồng</w:t>
+      </w:r>
+      <w:r>
+        <w:t xml:space="preserve">: </w:t>
+      </w:r>
+      <w:r>
+        <w:t xml:space="preserve">Đây là kỹ thuật then chốt để Server có thể phục vụ nhiều người chơi cùng lúc. Khi một Client mới kết nối thành công, Server sẽ tạo ra một luồng (Thread) độc lập để chuyên biệt xử lý các thông điệp từ Client đó, giúp giao diện Server không bị </w:t>
+      </w:r>
+      <w:r>
+        <w:t>“</w:t>
+      </w:r>
+      <w:r>
+        <w:t>đơ</w:t>
+      </w:r>
+      <w:r>
+        <w:t>”</w:t>
+      </w:r>
+      <w:r>
+        <w:t xml:space="preserve"> (freeze) và các cặp đấu không bị ảnh hưởng lẫn nhau.</w:t>
+      </w:r>
+    </w:p>
+    <w:p>
+      <w:r>
+        <w:t>Đồng bộ hóa luồng: Khi cập nhật giao diện từ các luồng mạng chạy ngầm, hệ thống áp dụng kỹ thuật Invoke để đảm bảo an toàn luồng, tránh xung đột tài nguyên trên WinForms.</w:t>
+      </w:r>
+    </w:p>
+    <w:p>
+      <w:pPr>
+        <w:pStyle w:val="Heading1"/>
+      </w:pPr>
+      <w:bookmarkStart w:id="4" w:name="_Toc227180420"/>
+      <w:r>
+        <w:t>THÀNH TỰU</w:t>
       </w:r>
       <w:bookmarkEnd w:id="4"/>
     </w:p>
     <w:p>
       <w:r>
-        <w:t>Về mặt kiến thức: Ứng dụng thành thạo các kiến thức đã học trong môn học, đặc biệt là lập trình giao tiếp mạng bằng TCP Socket, quản lý đa luồng (Multi</w:t>
-      </w:r>
-      <w:r>
-        <w:t>-</w:t>
-      </w:r>
-      <w:r>
-        <w:t>threading) và lập trình giao diện WinForms bằng C#.</w:t>
+        <w:t>Trong quá trình thực hiện đề tài lập trình game cờ Caro theo mô hình Client – Server, nhóm không chỉ hoàn thành các chức năng cơ bản của hệ thống mà còn tích lũy được nhiều kinh nghiệm thực tiễn quan trọng. Thông qua quá trình triển khai, nhóm đã nhận diện được những khó khăn, rút ra bài học, đồng thời đánh giá rõ những gì đã làm được và chưa làm được.</w:t>
       </w:r>
     </w:p>
     <w:p>
-      <w:r>
-        <w:t>Về mặt kỹ năng: Rèn luyện kỹ năng phân tích thiết kế hệ thống, xây dựng giao thức truyền tin riêng biệt giữa Client và Server, cũng như kỹ năng xử lý luồng dữ liệu, đọc/ghi file lưu trữ lịch sử thi đấu.</w:t>
-      </w:r>
+      <w:pPr>
+        <w:pStyle w:val="Heading2"/>
+      </w:pPr>
+      <w:r>
+        <w:t xml:space="preserve"> </w:t>
+      </w:r>
+      <w:bookmarkStart w:id="5" w:name="_Toc227180421"/>
+      <w:r>
+        <w:t>Những khó khăn gặp phải</w:t>
+      </w:r>
+      <w:bookmarkEnd w:id="5"/>
     </w:p>
     <w:p>
       <w:r>
-        <w:t>Về mặt sản phẩm: Tạo ra một phần mềm hoàn chỉnh, có giao diện trực quan, thân thiện, cho phép nhiều cặp người chơi có thể kết nối đến một máy chủ trung tâm để thách đấu, chơi cờ, tính giờ và lưu lại kết quả một cách chính xác, ổn định.</w:t>
+        <w:t>Trong quá trình triển khai đề tài, nhóm đã gặp nhiều khó khăn cả về kỹ thuật lẫn tư duy thiết kế hệ thống:</w:t>
       </w:r>
     </w:p>
     <w:p>
-      <w:pPr>
-        <w:pStyle w:val="Heading2"/>
-      </w:pPr>
-      <w:bookmarkStart w:id="5" w:name="_Toc224733377"/>
-      <w:r>
-        <w:t>Cơ sở lý thuyết áp dụng</w:t>
-      </w:r>
-      <w:bookmarkEnd w:id="5"/>
-      <w:r>
-        <w:t xml:space="preserve"> </w:t>
+      <w:r>
+        <w:t xml:space="preserve">Trước hết, việc tiếp cận lập trình mạng (Socket) là một thách thức lớn. Nhóm phải mất nhiều thời gian để hiểu cách thiết lập kết nối giữa client và server, cũng như cách xử lý các trường hợp mất kết nối hoặc dữ liệu bị lỗi. </w:t>
       </w:r>
     </w:p>
     <w:p>
       <w:r>
-        <w:t>Để hiện thực hóa hệ thống, dự án được xây dựng dựa trên các nền tảng lý thuyết cốt lõi sau:</w:t>
+        <w:lastRenderedPageBreak/>
+        <w:t xml:space="preserve">Vấn đề đồng bộ dữ liệu giữa các client là một trong những khó khăn quan trọng nhất. Do game yêu cầu tính thời gian thực, nên chỉ cần một sai lệch nhỏ cũng có thể làm hai bên hiển thị trạng thái khác nhau. </w:t>
       </w:r>
     </w:p>
     <w:p>
       <w:r>
-        <w:lastRenderedPageBreak/>
-        <w:t xml:space="preserve">Mô hình Client </w:t>
-      </w:r>
-      <w:r>
-        <w:t>-</w:t>
-      </w:r>
-      <w:r>
-        <w:t xml:space="preserve"> Server: Là mô hình kiến trúc mạng trong đó Server đóng vai trò trung tâm, lắng nghe các yêu cầu kết nối, quản lý danh sách người dùng và điều phối dữ liệu. Các Clients là những trạm trạm cuối, kết nối đến Server để gửi yêu cầu (thách đấu, đánh cờ) và nhận kết quả trả về.</w:t>
+        <w:t xml:space="preserve">Trong quá trình xây dựng server, nhóm gặp khó khăn với đa luồng (multi-threading). Việc quản lý nhiều client cùng lúc dễ gây ra lỗi tranh chấp dữ liệu nếu không kiểm soát tốt. </w:t>
+      </w:r>
+      <w:r>
+        <w:t xml:space="preserve"> </w:t>
       </w:r>
     </w:p>
     <w:p>
       <w:r>
-        <w:t>Giao thức TCP/IP</w:t>
-      </w:r>
-      <w:r>
-        <w:t xml:space="preserve">: </w:t>
-      </w:r>
-      <w:r>
-        <w:t>Dự án sử dụng TCP thay vì UDP để đảm bảo tính toàn vẹn của dữ liệu. Cờ Caro đòi hỏi tính chính xác tuyệt đối; mỗi nước đi</w:t>
-      </w:r>
-      <w:r>
-        <w:t xml:space="preserve"> </w:t>
-      </w:r>
-      <w:r>
-        <w:t>cần được truyền đi một cách an toàn, đúng thứ tự và không bị thất thoát trên đường truyền.</w:t>
+        <w:t xml:space="preserve">Chức năng đếm thời gian suy nghĩ đòi hỏi độ chính xác cao và phải đồng bộ với lượt chơi, điều này làm tăng độ phức tạp của hệ thống. </w:t>
       </w:r>
     </w:p>
     <w:p>
       <w:r>
-        <w:t>Lập trình Socket trong C#: Sử dụng các lớp TcpListener và TcpClient</w:t>
-      </w:r>
-      <w:r>
-        <w:t xml:space="preserve">. </w:t>
-      </w:r>
-      <w:r>
-        <w:t>Dữ liệu được trao đổi qua lại thông qua đối tượng NetworkStream dưới dạng các mảng byte.</w:t>
+        <w:t>Ngoài ra, việc thiết kế giao thức truyền dữ liệu ban đầu chưa hợp lý khiến nhóm phải chỉnh sửa nhiều lần để đạt được sự ổn định. Những khó khăn này cho thấy việc phát triển một hệ thống thực tế không chỉ dựa vào kiến thức lý thuyết mà còn đòi hỏi khả năng thử nghiệm và xử lý vấn đề phát sinh.</w:t>
       </w:r>
     </w:p>
     <w:p>
-      <w:r>
-        <w:t>Xử lý Đa luồng</w:t>
-      </w:r>
-      <w:r>
-        <w:t xml:space="preserve">: </w:t>
-      </w:r>
-      <w:r>
-        <w:t xml:space="preserve">Đây là kỹ thuật then chốt để Server có thể phục vụ nhiều người chơi cùng lúc. Khi một Client mới kết nối thành công, Server sẽ tạo ra một luồng (Thread) độc lập để chuyên biệt xử lý các thông điệp từ Client đó, giúp giao diện Server không bị </w:t>
-      </w:r>
-      <w:r>
-        <w:t>“</w:t>
-      </w:r>
-      <w:r>
-        <w:t>đơ</w:t>
-      </w:r>
-      <w:r>
-        <w:t>”</w:t>
-      </w:r>
-      <w:r>
-        <w:t xml:space="preserve"> (freeze) và các cặp đấu không bị ảnh hưởng lẫn nhau.</w:t>
-      </w:r>
+      <w:pPr>
+        <w:pStyle w:val="Heading2"/>
+      </w:pPr>
+      <w:bookmarkStart w:id="6" w:name="_Toc227180422"/>
+      <w:r>
+        <w:t>Những điều cần học hỏi và cải thiện:</w:t>
+      </w:r>
+      <w:bookmarkEnd w:id="6"/>
     </w:p>
     <w:p>
       <w:r>
-        <w:t>Đồng bộ hóa luồng: Khi cập nhật giao diện từ các luồng mạng chạy ngầm, hệ thống áp dụng kỹ thuật Invoke để đảm bảo an toàn luồng, tránh xung đột tài nguyên trên WinForms.</w:t>
+        <w:t>Qua quá trình thực hiện, nhóm nhận thấy bản thân còn thiếu và cần cải thiện ở nhiều khía cạnh:</w:t>
       </w:r>
     </w:p>
+    <w:p>
+      <w:r>
+        <w:t xml:space="preserve">Cần nâng cao kiến thức về lập trình mạng, đặc biệt là cách thiết kế giao thức truyền dữ liệu hiệu quả. Cải thiện kỹ năng xử lý đa luồng và đồng bộ dữ liệu để tránh lỗi trong hệ thống thời gian thực. </w:t>
+      </w:r>
+    </w:p>
+    <w:p>
+      <w:r>
+        <w:t xml:space="preserve">Học cách thiết kế hệ thống có cấu trúc rõ ràng, dễ mở rộng và bảo trì. Nâng cao kỹ năng debug và xử lý lỗi, đặc biệt với các lỗi khó phát hiện như lỗi mạng hoặc lỗi logic. </w:t>
+      </w:r>
+    </w:p>
+    <w:p>
+      <w:r>
+        <w:t xml:space="preserve">Cần học thêm về UI/UX để cải thiện giao diện người dùng, giúp sản phẩm trực quan hơn. </w:t>
+      </w:r>
+    </w:p>
+    <w:p>
+      <w:r>
+        <w:t>Việc tự đánh giá và rút kinh nghiệm là yếu tố quan trọng giúp nâng cao chất lượng báo cáo và năng lực cá nhân</w:t>
+      </w:r>
+    </w:p>
+    <w:p>
+      <w:pPr>
+        <w:pStyle w:val="Heading2"/>
+      </w:pPr>
+      <w:bookmarkStart w:id="7" w:name="_Toc227180423"/>
+      <w:r>
+        <w:t>Những gì đã làm được</w:t>
+      </w:r>
+      <w:bookmarkEnd w:id="7"/>
+    </w:p>
+    <w:p>
+      <w:r>
+        <w:t>Sau quá trình nghiên cứu và phát triển, nhóm đã đạt được nhiều kết quả cụ thể:</w:t>
+      </w:r>
+    </w:p>
+    <w:p>
+      <w:r>
+        <w:t xml:space="preserve">Xây dựng thành công hệ thống Client – Server hoạt động ổn định. </w:t>
+      </w:r>
+    </w:p>
+    <w:p>
+      <w:r>
+        <w:t xml:space="preserve">Cho phép hai người chơi kết nối và thi đấu online thông qua server. </w:t>
+      </w:r>
+    </w:p>
+    <w:p>
+      <w:r>
+        <w:t xml:space="preserve">Cài đặt hoàn chỉnh logic game Caro, bao gồm kiểm tra thắng/thua theo các hướng ngang, dọc và chéo. </w:t>
+      </w:r>
+    </w:p>
+    <w:p>
+      <w:r>
+        <w:lastRenderedPageBreak/>
+        <w:t xml:space="preserve">Đảm bảo đồng bộ nước đi giữa hai client theo thời gian thực. </w:t>
+      </w:r>
+    </w:p>
+    <w:p>
+      <w:r>
+        <w:t xml:space="preserve">Tích hợp thành công chức năng giới hạn thời gian suy nghĩ cho mỗi lượt chơi. </w:t>
+      </w:r>
+    </w:p>
+    <w:p>
+      <w:r>
+        <w:t xml:space="preserve">Xây dựng được cơ chế lưu lịch sử trận đấu, giúp theo dõi và phát triển hệ thống sau này. </w:t>
+      </w:r>
+    </w:p>
+    <w:p>
+      <w:r>
+        <w:t xml:space="preserve">Thiết kế được giao diện cơ bản, đảm bảo người chơi có thể thao tác dễ dàng. </w:t>
+      </w:r>
+    </w:p>
+    <w:p>
+      <w:r>
+        <w:t>Những kết quả này chứng minh rằng nhóm đã hoàn thành được các mục tiêu chính của đề tài và xây dựng được một hệ thống có thể hoạt động trong thực tế.</w:t>
+      </w:r>
+    </w:p>
+    <w:p>
+      <w:pPr>
+        <w:pStyle w:val="Heading2"/>
+        <w:rPr>
+          <w:rFonts w:eastAsia="Times New Roman" w:cs="Times New Roman"/>
+          <w:kern w:val="0"/>
+          <w:sz w:val="24"/>
+          <w:szCs w:val="24"/>
+          <w14:ligatures w14:val="none"/>
+        </w:rPr>
+      </w:pPr>
+      <w:bookmarkStart w:id="8" w:name="_Toc227180424"/>
+      <w:r>
+        <w:t>Những gì chưa làm được:</w:t>
+      </w:r>
+      <w:bookmarkEnd w:id="8"/>
+      <w:r>
+        <w:rPr>
+          <w:rFonts w:eastAsia="Times New Roman" w:cs="Times New Roman"/>
+          <w:kern w:val="0"/>
+          <w:sz w:val="24"/>
+          <w:szCs w:val="24"/>
+          <w14:ligatures w14:val="none"/>
+        </w:rPr>
+        <w:t xml:space="preserve"> </w:t>
+      </w:r>
+    </w:p>
+    <w:p>
+      <w:r>
+        <w:t>Bên cạnh những thành tựu đạt được, hệ thống vẫn còn tồn tại một số hạn chế:</w:t>
+      </w:r>
+    </w:p>
+    <w:p>
+      <w:r>
+        <w:t xml:space="preserve">Chưa phát triển chức năng chat giữa người chơi trong quá trình thi đấu. </w:t>
+      </w:r>
+    </w:p>
+    <w:p>
+      <w:r>
+        <w:t xml:space="preserve">Chưa tích hợp AI chơi với máy, nên chỉ hỗ trợ người chơi với nhau. </w:t>
+      </w:r>
+    </w:p>
+    <w:p>
+      <w:r>
+        <w:t xml:space="preserve">Giao diện còn đơn giản, chưa tối ưu về mặt thẩm mỹ và trải nghiệm người dùng. </w:t>
+      </w:r>
+    </w:p>
+    <w:p>
+      <w:r>
+        <w:t xml:space="preserve">Hệ thống mới chỉ hoạt động trong môi trường mạng nội bộ (LAN), chưa triển khai trên internet. </w:t>
+      </w:r>
+    </w:p>
+    <w:p>
+      <w:r>
+        <w:t xml:space="preserve">Chưa xây dựng được hệ thống tài khoản và xếp hạng (ranking) cho người chơi. </w:t>
+      </w:r>
+    </w:p>
+    <w:p>
+      <w:r>
+        <w:t>Những hạn chế này là cơ sở để nhóm tiếp tục cải tiến và phát triển đề tài trong tương lai.</w:t>
+      </w:r>
+    </w:p>
+    <w:p>
+      <w:pPr>
+        <w:pStyle w:val="Heading2"/>
+      </w:pPr>
+      <w:bookmarkStart w:id="9" w:name="_Toc227180425"/>
+      <w:r>
+        <w:t>Kinh nghiệm rút ra trong quá trình thực hiện</w:t>
+      </w:r>
+      <w:bookmarkEnd w:id="9"/>
+    </w:p>
+    <w:p>
+      <w:r>
+        <w:t>Qua đề tài, nhóm đã rút ra nhiều kinh nghiệm thực tế:</w:t>
+      </w:r>
+    </w:p>
+    <w:p>
+      <w:r>
+        <w:t xml:space="preserve">Cần lập kế hoạch rõ ràng ngay từ đầu, tránh việc sửa đổi nhiều lần gây mất thời gian. </w:t>
+      </w:r>
+    </w:p>
+    <w:p>
+      <w:r>
+        <w:t xml:space="preserve">Nên chia nhỏ hệ thống thành từng module để dễ phát triển và kiểm thử. </w:t>
+      </w:r>
+    </w:p>
+    <w:p>
+      <w:r>
+        <w:t xml:space="preserve">Việc test thường xuyên là rất quan trọng để phát hiện lỗi sớm. </w:t>
+      </w:r>
+    </w:p>
+    <w:p>
+      <w:r>
+        <w:t xml:space="preserve">Làm việc nhóm cần có phân công nhiệm vụ rõ ràng để tăng hiệu quả. </w:t>
+      </w:r>
+    </w:p>
+    <w:p>
+      <w:r>
+        <w:t xml:space="preserve">Khi gặp lỗi, cần kiên nhẫn phân tích từng bước thay vì sửa một cách ngẫu nhiên. </w:t>
+      </w:r>
+    </w:p>
+    <w:p>
+      <w:r>
+        <w:t>Những kinh nghiệm này phù hợp với thực tế rằng kiến thức thực tiễn thường khác với lý thuyết và cần linh hoạt áp dụng</w:t>
+      </w:r>
+    </w:p>
+    <w:p>
+      <w:pPr>
+        <w:pStyle w:val="Heading2"/>
+      </w:pPr>
+      <w:bookmarkStart w:id="10" w:name="_Toc227180426"/>
+      <w:r>
+        <w:t>Mức độ hoàn thành và đánh giá kết quả</w:t>
+      </w:r>
+      <w:bookmarkEnd w:id="10"/>
+    </w:p>
+    <w:p>
+      <w:r>
+        <w:t>So với mục tiêu ban đầu, đề tài đã đạt được</w:t>
+      </w:r>
+      <w:r>
+        <w:t xml:space="preserve"> </w:t>
+      </w:r>
+      <w:r>
+        <w:t>:</w:t>
+      </w:r>
+    </w:p>
+    <w:p>
+      <w:r>
+        <w:lastRenderedPageBreak/>
+        <w:t xml:space="preserve">Hoàn thành đầy đủ các chức năng cốt lõi của hệ thống </w:t>
+      </w:r>
+    </w:p>
+    <w:p>
+      <w:r>
+        <w:t xml:space="preserve">Đảm bảo hệ thống hoạt động ổn định trong phạm vi yêu cầu </w:t>
+      </w:r>
+    </w:p>
+    <w:p>
+      <w:r>
+        <w:t xml:space="preserve">Có khả năng mở rộng thêm các tính năng nâng cao </w:t>
+      </w:r>
+    </w:p>
+    <w:p>
+      <w:r>
+        <w:t>Tuy nhiên, các chức năng nâng cao vẫn chưa được triển khai đầy đủ do hạn chế về thời gian và kinh nghiệm.</w:t>
+      </w:r>
+    </w:p>
+    <w:p>
+      <w:pPr>
+        <w:pStyle w:val="Heading2"/>
+      </w:pPr>
+      <w:bookmarkStart w:id="11" w:name="_Toc227180427"/>
+      <w:r>
+        <w:t>Công nghệ và kỹ thuật nổi bật đã áp dụng</w:t>
+      </w:r>
+      <w:bookmarkEnd w:id="11"/>
+    </w:p>
+    <w:p>
+      <w:r>
+        <w:t>Trong quá trình phát triển dự án, nhóm đã vận dụng thành công nhiều công nghệ và kỹ thuật lập trình quan trọng, không chỉ giúp hệ thống hoạt động ổn định mà còn thể hiện sự hiểu biết sâu sắc về lập trình mạng.</w:t>
+      </w:r>
+    </w:p>
+    <w:p>
+      <w:r>
+        <w:t>Về giao tiếp mạng, nhóm sử dụng TCP Socket thông qua hai lớp TcpListener và TcpClient trong thư viện System.Net.Sockets. Việc lựa chọn TCP thay vì UDP xuất phát từ yêu cầu về tính toàn vẹn dữ liệu của game Cờ Caro – mỗi nước đi cần được đảm bảo đến đúng đối thủ, đúng thứ tự và không bị mất mát trên đường truyền. Dữ liệu được trao đổi qua NetworkStream dưới dạng chuỗi ký tự theo giao thức tự định nghĩa, sau đó được chuyển thành mảng byte để truyền đi.</w:t>
+      </w:r>
+    </w:p>
+    <w:p>
+      <w:r>
+        <w:t>Về xử lý đa luồng (Multi</w:t>
+      </w:r>
+      <w:r>
+        <w:t xml:space="preserve"> </w:t>
+      </w:r>
+      <w:r>
+        <w:t>-</w:t>
+      </w:r>
+      <w:r>
+        <w:t xml:space="preserve"> </w:t>
+      </w:r>
+      <w:r>
+        <w:t>threading), đây là kỹ thuật then chốt giúp Server có thể phục vụ nhiều người chơi cùng lúc. Mỗi khi một Client kết nối thành công, Server sẽ khởi tạo một luồng (Thread) riêng biệt để xử lý các thông điệp từ Client đó. Nhờ vậy, giao diện Server không bị “đơ” (freeze) khi có nhiều kết nối đồng thời, và các cặp đấu khác nhau không làm ảnh hưởng lẫn nhau. Cụ thể, nhóm đã sử dụng lớp Thread trong System.Threading và áp dụng mô hình “một luồng trên mỗi client” – một thiết kế tuy cổ điển nhưng dễ hiểu và hiệu quả trong phạm vi đồ án môn học.</w:t>
+      </w:r>
+    </w:p>
+    <w:p>
+      <w:r>
+        <w:t>Về đồng bộ hóa giao diện người dùng, do các luồng mạng chạy ngầm không thể trực tiếp cập nhật các điều khiển (controls) trên WinForms, nhóm đã áp dụng kỹ thuật Invoke (thông qua phương thức Control.Invoke hoặc BeginInvoke). Kỹ thuật này cho phép các luồng phụ “ủy nhiệm” công việc cập nhật giao diện cho luồng chính (UI thread), đảm bảo an toàn khi truy cập tài nguyên chung, tránh các lỗi tranh chấp dữ liệu (race condition) hoặc lỗi “cross-thread operation”.</w:t>
+      </w:r>
+    </w:p>
+    <w:p>
+      <w:r>
+        <w:t xml:space="preserve">Về xử lý thời gian thực, chức năng đếm giờ cho mỗi lượt đi được cài đặt bằng System.Windows.Forms.Timer kết hợp với cơ chế đồng bộ giữa Server và Client. Timer </w:t>
+      </w:r>
+      <w:r>
+        <w:lastRenderedPageBreak/>
+        <w:t>được khởi động lại sau mỗi nước đi hợp lệ, và nếu hết giờ, Server sẽ tự động gửi tín hiệu TIME_OUT để chuyển lượt hoặc kết thúc ván đấu. Yêu cầu về độ chính xác cao đã được giải quyết bằng cách để Server là nơi quản lý thời gian tập trung, thay vì để mỗi Client tự đếm giờ riêng lẻ.</w:t>
+      </w:r>
+    </w:p>
+    <w:p>
+      <w:r>
+        <w:t>Về lưu trữ dữ liệu, lịch sử thi đấu được ghi vào file .txt với định dạng có cấu trúc, bao gồm: thời gian diễn ra trận đấu, tên hai người chơi, tổng số nước đi, người thắng cuộc và toàn bộ bàn cờ. Việc sử dụng StreamWriter và File.AppendAllText giúp việc ghi log trở nên đơn giản nhưng vẫn đảm bảo tính toàn vẹn dữ liệu, phục vụ tốt cho mục đích theo dõi và phát triển sau này.</w:t>
+      </w:r>
+    </w:p>
+    <w:p>
+      <w:r>
+        <w:t>Về giao thức truyền tin, nhóm đã tự thiết kế một giao thức đơn giản nhưng đầy đủ với cấu trúc COMMAND|DATA1|DATA2|... Các lệnh như LOGIN, CHALLENGE, MOVE, WIN, TIME_OUT... được định nghĩa rõ ràng, giúp việc phân tích và xử lý dữ liệu ở cả hai phía Client và Server trở nên nhất quán và dễ dàng mở rộng sau này.</w:t>
+      </w:r>
+    </w:p>
+    <w:p>
+      <w:r>
+        <w:t>Tóm lại, sự kết hợp nhuần nhuyễn giữa TCP Socket, đa luồng, đồng bộ hóa Invoke, timer thời gian thực và giao thức truyền tin tự định nghĩa đã tạo nên một hệ thống hoạt động trơn tru, đáp ứng tốt các yêu cầu kỹ thuật của môn Lập trình mạng.</w:t>
+      </w:r>
+    </w:p>
+    <w:p>
+      <w:pPr>
+        <w:pStyle w:val="Heading1"/>
+      </w:pPr>
+      <w:bookmarkStart w:id="12" w:name="_Toc227180428"/>
+      <w:r>
+        <w:t>KẾT LUẬN</w:t>
+      </w:r>
+      <w:bookmarkEnd w:id="12"/>
+    </w:p>
+    <w:p>
+      <w:r>
+        <w:t>Sau một thời gian nghiên cứu, thiết kế và triển khai, dự án "Lập trình game Cờ Caro theo mô hình Client – Server (UDM_17)" đã được nhóm hoàn thành đúng theo các yêu cầu cốt lõi của môn học Lập trình mạng.</w:t>
+      </w:r>
+    </w:p>
+    <w:p>
+      <w:r>
+        <w:t>Hệ thống đã đáp ứng được những mục tiêu quan trọng nhất đề ra ban đầu: xây dựng thành công một máy chủ (Server) có khả năng quản lý nhiều kết nối đồng thời, điều phối các cặp đấu và đồng bộ hóa trạng thái bàn cờ theo thời gian thực giữa hai người chơi (Client). Sản phẩm hoàn chỉnh bao gồm đầy đủ logic game Cờ Caro (kiểm tra thắng thua theo chiều ngang, dọc, chéo), chức năng tính giờ cho mỗi lượt đi, cũng như cơ chế lưu lại lịch sử thi đấu – một minh chứng rõ nét cho việc ứng dụng thành công các kiến thức về TCP Socket, đa luồng (Multi</w:t>
+      </w:r>
+      <w:r>
+        <w:t xml:space="preserve"> </w:t>
+      </w:r>
+      <w:r>
+        <w:t>-</w:t>
+      </w:r>
+      <w:r>
+        <w:t xml:space="preserve"> </w:t>
+      </w:r>
+      <w:r>
+        <w:t>threading) và đồng bộ hóa dữ liệu trong môi trường mạng.</w:t>
+      </w:r>
+    </w:p>
+    <w:p>
+      <w:r>
+        <w:t xml:space="preserve">Bên cạnh những kết quả đã đạt được, nhóm cũng thẳng thắn nhìn nhận những hạn chế như giao diện chưa thực sự tối ưu, thiếu chức năng chat, chưa có chế độ chơi với AI hay hệ </w:t>
+      </w:r>
+      <w:r>
+        <w:lastRenderedPageBreak/>
+        <w:t>thống xếp hạng người chơi. Đây không phải là những thất bại, mà chính là những bài học quý giá và là cơ sở định hướng cho các bước phát triển tiếp theo của dự án.</w:t>
+      </w:r>
+    </w:p>
+    <w:p>
+      <w:r>
+        <w:t>Tóm lại, đề tài không chỉ giúp nhóm củng cố và ứng dụng sâu sắc lý thuyết Lập trình mạng vào thực tế, mà còn rèn luyện các kỹ năng làm việc nhóm, giải quyết vấn đề và tư duy hệ thống. Sản phẩm tạo ra tuy còn đơn giản nhưng là một bước đệm vững chắc, mở ra cơ hội phát triển thành một ứng dụng giải trí trực tuyến hoàn chỉnh trong tương lai.</w:t>
+      </w:r>
+    </w:p>
+    <w:p/>
+    <w:p>
+      <w:pPr>
+        <w:ind w:left="360"/>
+      </w:pPr>
+    </w:p>
+    <w:p>
+      <w:pPr>
+        <w:ind w:left="360"/>
+      </w:pPr>
+    </w:p>
+    <w:p>
+      <w:pPr>
+        <w:ind w:left="360"/>
+      </w:pPr>
+    </w:p>
+    <w:p>
+      <w:pPr>
+        <w:ind w:left="360"/>
+      </w:pPr>
+    </w:p>
+    <w:p>
+      <w:pPr>
+        <w:ind w:left="360"/>
+      </w:pPr>
+    </w:p>
+    <w:p/>
     <w:p/>
     <w:p/>
     <w:p/>
@@ -2192,6 +3275,155 @@
     </w:lvl>
   </w:abstractNum>
   <w:abstractNum w:abstractNumId="4" w15:restartNumberingAfterBreak="0">
+    <w:nsid w:val="05105DC3"/>
+    <w:multiLevelType w:val="multilevel"/>
+    <w:tmpl w:val="AB62554C"/>
+    <w:lvl w:ilvl="0">
+      <w:start w:val="1"/>
+      <w:numFmt w:val="bullet"/>
+      <w:lvlText w:val=""/>
+      <w:lvlJc w:val="left"/>
+      <w:pPr>
+        <w:tabs>
+          <w:tab w:val="num" w:pos="720"/>
+        </w:tabs>
+        <w:ind w:left="720" w:hanging="360"/>
+      </w:pPr>
+      <w:rPr>
+        <w:rFonts w:ascii="Symbol" w:hAnsi="Symbol" w:hint="default"/>
+        <w:sz w:val="20"/>
+      </w:rPr>
+    </w:lvl>
+    <w:lvl w:ilvl="1" w:tentative="1">
+      <w:start w:val="1"/>
+      <w:numFmt w:val="bullet"/>
+      <w:lvlText w:val="o"/>
+      <w:lvlJc w:val="left"/>
+      <w:pPr>
+        <w:tabs>
+          <w:tab w:val="num" w:pos="1440"/>
+        </w:tabs>
+        <w:ind w:left="1440" w:hanging="360"/>
+      </w:pPr>
+      <w:rPr>
+        <w:rFonts w:ascii="Courier New" w:hAnsi="Courier New" w:hint="default"/>
+        <w:sz w:val="20"/>
+      </w:rPr>
+    </w:lvl>
+    <w:lvl w:ilvl="2" w:tentative="1">
+      <w:start w:val="1"/>
+      <w:numFmt w:val="bullet"/>
+      <w:lvlText w:val=""/>
+      <w:lvlJc w:val="left"/>
+      <w:pPr>
+        <w:tabs>
+          <w:tab w:val="num" w:pos="2160"/>
+        </w:tabs>
+        <w:ind w:left="2160" w:hanging="360"/>
+      </w:pPr>
+      <w:rPr>
+        <w:rFonts w:ascii="Wingdings" w:hAnsi="Wingdings" w:hint="default"/>
+        <w:sz w:val="20"/>
+      </w:rPr>
+    </w:lvl>
+    <w:lvl w:ilvl="3" w:tentative="1">
+      <w:start w:val="1"/>
+      <w:numFmt w:val="bullet"/>
+      <w:lvlText w:val=""/>
+      <w:lvlJc w:val="left"/>
+      <w:pPr>
+        <w:tabs>
+          <w:tab w:val="num" w:pos="2880"/>
+        </w:tabs>
+        <w:ind w:left="2880" w:hanging="360"/>
+      </w:pPr>
+      <w:rPr>
+        <w:rFonts w:ascii="Wingdings" w:hAnsi="Wingdings" w:hint="default"/>
+        <w:sz w:val="20"/>
+      </w:rPr>
+    </w:lvl>
+    <w:lvl w:ilvl="4" w:tentative="1">
+      <w:start w:val="1"/>
+      <w:numFmt w:val="bullet"/>
+      <w:lvlText w:val=""/>
+      <w:lvlJc w:val="left"/>
+      <w:pPr>
+        <w:tabs>
+          <w:tab w:val="num" w:pos="3600"/>
+        </w:tabs>
+        <w:ind w:left="3600" w:hanging="360"/>
+      </w:pPr>
+      <w:rPr>
+        <w:rFonts w:ascii="Wingdings" w:hAnsi="Wingdings" w:hint="default"/>
+        <w:sz w:val="20"/>
+      </w:rPr>
+    </w:lvl>
+    <w:lvl w:ilvl="5" w:tentative="1">
+      <w:start w:val="1"/>
+      <w:numFmt w:val="bullet"/>
+      <w:lvlText w:val=""/>
+      <w:lvlJc w:val="left"/>
+      <w:pPr>
+        <w:tabs>
+          <w:tab w:val="num" w:pos="4320"/>
+        </w:tabs>
+        <w:ind w:left="4320" w:hanging="360"/>
+      </w:pPr>
+      <w:rPr>
+        <w:rFonts w:ascii="Wingdings" w:hAnsi="Wingdings" w:hint="default"/>
+        <w:sz w:val="20"/>
+      </w:rPr>
+    </w:lvl>
+    <w:lvl w:ilvl="6" w:tentative="1">
+      <w:start w:val="1"/>
+      <w:numFmt w:val="bullet"/>
+      <w:lvlText w:val=""/>
+      <w:lvlJc w:val="left"/>
+      <w:pPr>
+        <w:tabs>
+          <w:tab w:val="num" w:pos="5040"/>
+        </w:tabs>
+        <w:ind w:left="5040" w:hanging="360"/>
+      </w:pPr>
+      <w:rPr>
+        <w:rFonts w:ascii="Wingdings" w:hAnsi="Wingdings" w:hint="default"/>
+        <w:sz w:val="20"/>
+      </w:rPr>
+    </w:lvl>
+    <w:lvl w:ilvl="7" w:tentative="1">
+      <w:start w:val="1"/>
+      <w:numFmt w:val="bullet"/>
+      <w:lvlText w:val=""/>
+      <w:lvlJc w:val="left"/>
+      <w:pPr>
+        <w:tabs>
+          <w:tab w:val="num" w:pos="5760"/>
+        </w:tabs>
+        <w:ind w:left="5760" w:hanging="360"/>
+      </w:pPr>
+      <w:rPr>
+        <w:rFonts w:ascii="Wingdings" w:hAnsi="Wingdings" w:hint="default"/>
+        <w:sz w:val="20"/>
+      </w:rPr>
+    </w:lvl>
+    <w:lvl w:ilvl="8" w:tentative="1">
+      <w:start w:val="1"/>
+      <w:numFmt w:val="bullet"/>
+      <w:lvlText w:val=""/>
+      <w:lvlJc w:val="left"/>
+      <w:pPr>
+        <w:tabs>
+          <w:tab w:val="num" w:pos="6480"/>
+        </w:tabs>
+        <w:ind w:left="6480" w:hanging="360"/>
+      </w:pPr>
+      <w:rPr>
+        <w:rFonts w:ascii="Wingdings" w:hAnsi="Wingdings" w:hint="default"/>
+        <w:sz w:val="20"/>
+      </w:rPr>
+    </w:lvl>
+  </w:abstractNum>
+  <w:abstractNum w:abstractNumId="5" w15:restartNumberingAfterBreak="0">
     <w:nsid w:val="063B2D76"/>
     <w:multiLevelType w:val="hybridMultilevel"/>
     <w:tmpl w:val="23422754"/>
@@ -2304,7 +3536,7 @@
       </w:rPr>
     </w:lvl>
   </w:abstractNum>
-  <w:abstractNum w:abstractNumId="5" w15:restartNumberingAfterBreak="0">
+  <w:abstractNum w:abstractNumId="6" w15:restartNumberingAfterBreak="0">
     <w:nsid w:val="08096DC9"/>
     <w:multiLevelType w:val="multilevel"/>
     <w:tmpl w:val="0200F968"/>
@@ -2453,7 +3685,7 @@
       </w:rPr>
     </w:lvl>
   </w:abstractNum>
-  <w:abstractNum w:abstractNumId="6" w15:restartNumberingAfterBreak="0">
+  <w:abstractNum w:abstractNumId="7" w15:restartNumberingAfterBreak="0">
     <w:nsid w:val="093B532F"/>
     <w:multiLevelType w:val="hybridMultilevel"/>
     <w:tmpl w:val="22A434CE"/>
@@ -2539,7 +3771,7 @@
       </w:pPr>
     </w:lvl>
   </w:abstractNum>
-  <w:abstractNum w:abstractNumId="7" w15:restartNumberingAfterBreak="0">
+  <w:abstractNum w:abstractNumId="8" w15:restartNumberingAfterBreak="0">
     <w:nsid w:val="0A604486"/>
     <w:multiLevelType w:val="hybridMultilevel"/>
     <w:tmpl w:val="22A434CE"/>
@@ -2625,7 +3857,7 @@
       </w:pPr>
     </w:lvl>
   </w:abstractNum>
-  <w:abstractNum w:abstractNumId="8" w15:restartNumberingAfterBreak="0">
+  <w:abstractNum w:abstractNumId="9" w15:restartNumberingAfterBreak="0">
     <w:nsid w:val="0A8E2DFB"/>
     <w:multiLevelType w:val="hybridMultilevel"/>
     <w:tmpl w:val="C804F3AA"/>
@@ -2738,7 +3970,7 @@
       </w:rPr>
     </w:lvl>
   </w:abstractNum>
-  <w:abstractNum w:abstractNumId="9" w15:restartNumberingAfterBreak="0">
+  <w:abstractNum w:abstractNumId="10" w15:restartNumberingAfterBreak="0">
     <w:nsid w:val="0B8D63BF"/>
     <w:multiLevelType w:val="hybridMultilevel"/>
     <w:tmpl w:val="DFEABE24"/>
@@ -2851,7 +4083,7 @@
       </w:rPr>
     </w:lvl>
   </w:abstractNum>
-  <w:abstractNum w:abstractNumId="10" w15:restartNumberingAfterBreak="0">
+  <w:abstractNum w:abstractNumId="11" w15:restartNumberingAfterBreak="0">
     <w:nsid w:val="0BB021AE"/>
     <w:multiLevelType w:val="multilevel"/>
     <w:tmpl w:val="713A57CC"/>
@@ -3000,7 +4232,7 @@
       </w:rPr>
     </w:lvl>
   </w:abstractNum>
-  <w:abstractNum w:abstractNumId="11" w15:restartNumberingAfterBreak="0">
+  <w:abstractNum w:abstractNumId="12" w15:restartNumberingAfterBreak="0">
     <w:nsid w:val="0E797209"/>
     <w:multiLevelType w:val="hybridMultilevel"/>
     <w:tmpl w:val="0CD0CF30"/>
@@ -3086,7 +4318,7 @@
       </w:pPr>
     </w:lvl>
   </w:abstractNum>
-  <w:abstractNum w:abstractNumId="12" w15:restartNumberingAfterBreak="0">
+  <w:abstractNum w:abstractNumId="13" w15:restartNumberingAfterBreak="0">
     <w:nsid w:val="0F56146F"/>
     <w:multiLevelType w:val="hybridMultilevel"/>
     <w:tmpl w:val="4B3CA6F0"/>
@@ -3199,7 +4431,7 @@
       </w:rPr>
     </w:lvl>
   </w:abstractNum>
-  <w:abstractNum w:abstractNumId="13" w15:restartNumberingAfterBreak="0">
+  <w:abstractNum w:abstractNumId="14" w15:restartNumberingAfterBreak="0">
     <w:nsid w:val="109262FB"/>
     <w:multiLevelType w:val="hybridMultilevel"/>
     <w:tmpl w:val="D766E1F4"/>
@@ -3312,7 +4544,156 @@
       </w:rPr>
     </w:lvl>
   </w:abstractNum>
-  <w:abstractNum w:abstractNumId="14" w15:restartNumberingAfterBreak="0">
+  <w:abstractNum w:abstractNumId="15" w15:restartNumberingAfterBreak="0">
+    <w:nsid w:val="147F733D"/>
+    <w:multiLevelType w:val="multilevel"/>
+    <w:tmpl w:val="55C6FDE2"/>
+    <w:lvl w:ilvl="0">
+      <w:start w:val="1"/>
+      <w:numFmt w:val="bullet"/>
+      <w:lvlText w:val=""/>
+      <w:lvlJc w:val="left"/>
+      <w:pPr>
+        <w:tabs>
+          <w:tab w:val="num" w:pos="720"/>
+        </w:tabs>
+        <w:ind w:left="720" w:hanging="360"/>
+      </w:pPr>
+      <w:rPr>
+        <w:rFonts w:ascii="Symbol" w:hAnsi="Symbol" w:hint="default"/>
+        <w:sz w:val="20"/>
+      </w:rPr>
+    </w:lvl>
+    <w:lvl w:ilvl="1" w:tentative="1">
+      <w:start w:val="1"/>
+      <w:numFmt w:val="bullet"/>
+      <w:lvlText w:val="o"/>
+      <w:lvlJc w:val="left"/>
+      <w:pPr>
+        <w:tabs>
+          <w:tab w:val="num" w:pos="1440"/>
+        </w:tabs>
+        <w:ind w:left="1440" w:hanging="360"/>
+      </w:pPr>
+      <w:rPr>
+        <w:rFonts w:ascii="Courier New" w:hAnsi="Courier New" w:hint="default"/>
+        <w:sz w:val="20"/>
+      </w:rPr>
+    </w:lvl>
+    <w:lvl w:ilvl="2" w:tentative="1">
+      <w:start w:val="1"/>
+      <w:numFmt w:val="bullet"/>
+      <w:lvlText w:val=""/>
+      <w:lvlJc w:val="left"/>
+      <w:pPr>
+        <w:tabs>
+          <w:tab w:val="num" w:pos="2160"/>
+        </w:tabs>
+        <w:ind w:left="2160" w:hanging="360"/>
+      </w:pPr>
+      <w:rPr>
+        <w:rFonts w:ascii="Wingdings" w:hAnsi="Wingdings" w:hint="default"/>
+        <w:sz w:val="20"/>
+      </w:rPr>
+    </w:lvl>
+    <w:lvl w:ilvl="3" w:tentative="1">
+      <w:start w:val="1"/>
+      <w:numFmt w:val="bullet"/>
+      <w:lvlText w:val=""/>
+      <w:lvlJc w:val="left"/>
+      <w:pPr>
+        <w:tabs>
+          <w:tab w:val="num" w:pos="2880"/>
+        </w:tabs>
+        <w:ind w:left="2880" w:hanging="360"/>
+      </w:pPr>
+      <w:rPr>
+        <w:rFonts w:ascii="Wingdings" w:hAnsi="Wingdings" w:hint="default"/>
+        <w:sz w:val="20"/>
+      </w:rPr>
+    </w:lvl>
+    <w:lvl w:ilvl="4" w:tentative="1">
+      <w:start w:val="1"/>
+      <w:numFmt w:val="bullet"/>
+      <w:lvlText w:val=""/>
+      <w:lvlJc w:val="left"/>
+      <w:pPr>
+        <w:tabs>
+          <w:tab w:val="num" w:pos="3600"/>
+        </w:tabs>
+        <w:ind w:left="3600" w:hanging="360"/>
+      </w:pPr>
+      <w:rPr>
+        <w:rFonts w:ascii="Wingdings" w:hAnsi="Wingdings" w:hint="default"/>
+        <w:sz w:val="20"/>
+      </w:rPr>
+    </w:lvl>
+    <w:lvl w:ilvl="5" w:tentative="1">
+      <w:start w:val="1"/>
+      <w:numFmt w:val="bullet"/>
+      <w:lvlText w:val=""/>
+      <w:lvlJc w:val="left"/>
+      <w:pPr>
+        <w:tabs>
+          <w:tab w:val="num" w:pos="4320"/>
+        </w:tabs>
+        <w:ind w:left="4320" w:hanging="360"/>
+      </w:pPr>
+      <w:rPr>
+        <w:rFonts w:ascii="Wingdings" w:hAnsi="Wingdings" w:hint="default"/>
+        <w:sz w:val="20"/>
+      </w:rPr>
+    </w:lvl>
+    <w:lvl w:ilvl="6" w:tentative="1">
+      <w:start w:val="1"/>
+      <w:numFmt w:val="bullet"/>
+      <w:lvlText w:val=""/>
+      <w:lvlJc w:val="left"/>
+      <w:pPr>
+        <w:tabs>
+          <w:tab w:val="num" w:pos="5040"/>
+        </w:tabs>
+        <w:ind w:left="5040" w:hanging="360"/>
+      </w:pPr>
+      <w:rPr>
+        <w:rFonts w:ascii="Wingdings" w:hAnsi="Wingdings" w:hint="default"/>
+        <w:sz w:val="20"/>
+      </w:rPr>
+    </w:lvl>
+    <w:lvl w:ilvl="7" w:tentative="1">
+      <w:start w:val="1"/>
+      <w:numFmt w:val="bullet"/>
+      <w:lvlText w:val=""/>
+      <w:lvlJc w:val="left"/>
+      <w:pPr>
+        <w:tabs>
+          <w:tab w:val="num" w:pos="5760"/>
+        </w:tabs>
+        <w:ind w:left="5760" w:hanging="360"/>
+      </w:pPr>
+      <w:rPr>
+        <w:rFonts w:ascii="Wingdings" w:hAnsi="Wingdings" w:hint="default"/>
+        <w:sz w:val="20"/>
+      </w:rPr>
+    </w:lvl>
+    <w:lvl w:ilvl="8" w:tentative="1">
+      <w:start w:val="1"/>
+      <w:numFmt w:val="bullet"/>
+      <w:lvlText w:val=""/>
+      <w:lvlJc w:val="left"/>
+      <w:pPr>
+        <w:tabs>
+          <w:tab w:val="num" w:pos="6480"/>
+        </w:tabs>
+        <w:ind w:left="6480" w:hanging="360"/>
+      </w:pPr>
+      <w:rPr>
+        <w:rFonts w:ascii="Wingdings" w:hAnsi="Wingdings" w:hint="default"/>
+        <w:sz w:val="20"/>
+      </w:rPr>
+    </w:lvl>
+  </w:abstractNum>
+  <w:abstractNum w:abstractNumId="16" w15:restartNumberingAfterBreak="0">
     <w:nsid w:val="1C552D49"/>
     <w:multiLevelType w:val="hybridMultilevel"/>
     <w:tmpl w:val="BB30A42C"/>
@@ -3425,7 +4806,7 @@
       </w:rPr>
     </w:lvl>
   </w:abstractNum>
-  <w:abstractNum w:abstractNumId="15" w15:restartNumberingAfterBreak="0">
+  <w:abstractNum w:abstractNumId="17" w15:restartNumberingAfterBreak="0">
     <w:nsid w:val="1D0A38F6"/>
     <w:multiLevelType w:val="multilevel"/>
     <w:tmpl w:val="EDEC25FA"/>
@@ -3574,7 +4955,7 @@
       </w:rPr>
     </w:lvl>
   </w:abstractNum>
-  <w:abstractNum w:abstractNumId="16" w15:restartNumberingAfterBreak="0">
+  <w:abstractNum w:abstractNumId="18" w15:restartNumberingAfterBreak="0">
     <w:nsid w:val="1E5A1910"/>
     <w:multiLevelType w:val="hybridMultilevel"/>
     <w:tmpl w:val="5F861B32"/>
@@ -3687,7 +5068,156 @@
       </w:rPr>
     </w:lvl>
   </w:abstractNum>
-  <w:abstractNum w:abstractNumId="17" w15:restartNumberingAfterBreak="0">
+  <w:abstractNum w:abstractNumId="19" w15:restartNumberingAfterBreak="0">
+    <w:nsid w:val="22AB2FCC"/>
+    <w:multiLevelType w:val="multilevel"/>
+    <w:tmpl w:val="B63A3FF2"/>
+    <w:lvl w:ilvl="0">
+      <w:start w:val="1"/>
+      <w:numFmt w:val="bullet"/>
+      <w:lvlText w:val=""/>
+      <w:lvlJc w:val="left"/>
+      <w:pPr>
+        <w:tabs>
+          <w:tab w:val="num" w:pos="720"/>
+        </w:tabs>
+        <w:ind w:left="720" w:hanging="360"/>
+      </w:pPr>
+      <w:rPr>
+        <w:rFonts w:ascii="Symbol" w:hAnsi="Symbol" w:hint="default"/>
+        <w:sz w:val="20"/>
+      </w:rPr>
+    </w:lvl>
+    <w:lvl w:ilvl="1" w:tentative="1">
+      <w:start w:val="1"/>
+      <w:numFmt w:val="bullet"/>
+      <w:lvlText w:val="o"/>
+      <w:lvlJc w:val="left"/>
+      <w:pPr>
+        <w:tabs>
+          <w:tab w:val="num" w:pos="1440"/>
+        </w:tabs>
+        <w:ind w:left="1440" w:hanging="360"/>
+      </w:pPr>
+      <w:rPr>
+        <w:rFonts w:ascii="Courier New" w:hAnsi="Courier New" w:hint="default"/>
+        <w:sz w:val="20"/>
+      </w:rPr>
+    </w:lvl>
+    <w:lvl w:ilvl="2" w:tentative="1">
+      <w:start w:val="1"/>
+      <w:numFmt w:val="bullet"/>
+      <w:lvlText w:val=""/>
+      <w:lvlJc w:val="left"/>
+      <w:pPr>
+        <w:tabs>
+          <w:tab w:val="num" w:pos="2160"/>
+        </w:tabs>
+        <w:ind w:left="2160" w:hanging="360"/>
+      </w:pPr>
+      <w:rPr>
+        <w:rFonts w:ascii="Wingdings" w:hAnsi="Wingdings" w:hint="default"/>
+        <w:sz w:val="20"/>
+      </w:rPr>
+    </w:lvl>
+    <w:lvl w:ilvl="3" w:tentative="1">
+      <w:start w:val="1"/>
+      <w:numFmt w:val="bullet"/>
+      <w:lvlText w:val=""/>
+      <w:lvlJc w:val="left"/>
+      <w:pPr>
+        <w:tabs>
+          <w:tab w:val="num" w:pos="2880"/>
+        </w:tabs>
+        <w:ind w:left="2880" w:hanging="360"/>
+      </w:pPr>
+      <w:rPr>
+        <w:rFonts w:ascii="Wingdings" w:hAnsi="Wingdings" w:hint="default"/>
+        <w:sz w:val="20"/>
+      </w:rPr>
+    </w:lvl>
+    <w:lvl w:ilvl="4" w:tentative="1">
+      <w:start w:val="1"/>
+      <w:numFmt w:val="bullet"/>
+      <w:lvlText w:val=""/>
+      <w:lvlJc w:val="left"/>
+      <w:pPr>
+        <w:tabs>
+          <w:tab w:val="num" w:pos="3600"/>
+        </w:tabs>
+        <w:ind w:left="3600" w:hanging="360"/>
+      </w:pPr>
+      <w:rPr>
+        <w:rFonts w:ascii="Wingdings" w:hAnsi="Wingdings" w:hint="default"/>
+        <w:sz w:val="20"/>
+      </w:rPr>
+    </w:lvl>
+    <w:lvl w:ilvl="5" w:tentative="1">
+      <w:start w:val="1"/>
+      <w:numFmt w:val="bullet"/>
+      <w:lvlText w:val=""/>
+      <w:lvlJc w:val="left"/>
+      <w:pPr>
+        <w:tabs>
+          <w:tab w:val="num" w:pos="4320"/>
+        </w:tabs>
+        <w:ind w:left="4320" w:hanging="360"/>
+      </w:pPr>
+      <w:rPr>
+        <w:rFonts w:ascii="Wingdings" w:hAnsi="Wingdings" w:hint="default"/>
+        <w:sz w:val="20"/>
+      </w:rPr>
+    </w:lvl>
+    <w:lvl w:ilvl="6" w:tentative="1">
+      <w:start w:val="1"/>
+      <w:numFmt w:val="bullet"/>
+      <w:lvlText w:val=""/>
+      <w:lvlJc w:val="left"/>
+      <w:pPr>
+        <w:tabs>
+          <w:tab w:val="num" w:pos="5040"/>
+        </w:tabs>
+        <w:ind w:left="5040" w:hanging="360"/>
+      </w:pPr>
+      <w:rPr>
+        <w:rFonts w:ascii="Wingdings" w:hAnsi="Wingdings" w:hint="default"/>
+        <w:sz w:val="20"/>
+      </w:rPr>
+    </w:lvl>
+    <w:lvl w:ilvl="7" w:tentative="1">
+      <w:start w:val="1"/>
+      <w:numFmt w:val="bullet"/>
+      <w:lvlText w:val=""/>
+      <w:lvlJc w:val="left"/>
+      <w:pPr>
+        <w:tabs>
+          <w:tab w:val="num" w:pos="5760"/>
+        </w:tabs>
+        <w:ind w:left="5760" w:hanging="360"/>
+      </w:pPr>
+      <w:rPr>
+        <w:rFonts w:ascii="Wingdings" w:hAnsi="Wingdings" w:hint="default"/>
+        <w:sz w:val="20"/>
+      </w:rPr>
+    </w:lvl>
+    <w:lvl w:ilvl="8" w:tentative="1">
+      <w:start w:val="1"/>
+      <w:numFmt w:val="bullet"/>
+      <w:lvlText w:val=""/>
+      <w:lvlJc w:val="left"/>
+      <w:pPr>
+        <w:tabs>
+          <w:tab w:val="num" w:pos="6480"/>
+        </w:tabs>
+        <w:ind w:left="6480" w:hanging="360"/>
+      </w:pPr>
+      <w:rPr>
+        <w:rFonts w:ascii="Wingdings" w:hAnsi="Wingdings" w:hint="default"/>
+        <w:sz w:val="20"/>
+      </w:rPr>
+    </w:lvl>
+  </w:abstractNum>
+  <w:abstractNum w:abstractNumId="20" w15:restartNumberingAfterBreak="0">
     <w:nsid w:val="23105B27"/>
     <w:multiLevelType w:val="hybridMultilevel"/>
     <w:tmpl w:val="846483D8"/>
@@ -3800,7 +5330,7 @@
       </w:rPr>
     </w:lvl>
   </w:abstractNum>
-  <w:abstractNum w:abstractNumId="18" w15:restartNumberingAfterBreak="0">
+  <w:abstractNum w:abstractNumId="21" w15:restartNumberingAfterBreak="0">
     <w:nsid w:val="234A7A2D"/>
     <w:multiLevelType w:val="hybridMultilevel"/>
     <w:tmpl w:val="E812831E"/>
@@ -3913,7 +5443,7 @@
       </w:rPr>
     </w:lvl>
   </w:abstractNum>
-  <w:abstractNum w:abstractNumId="19" w15:restartNumberingAfterBreak="0">
+  <w:abstractNum w:abstractNumId="22" w15:restartNumberingAfterBreak="0">
     <w:nsid w:val="26716DEE"/>
     <w:multiLevelType w:val="hybridMultilevel"/>
     <w:tmpl w:val="2EE09F38"/>
@@ -4026,7 +5556,156 @@
       </w:rPr>
     </w:lvl>
   </w:abstractNum>
-  <w:abstractNum w:abstractNumId="20" w15:restartNumberingAfterBreak="0">
+  <w:abstractNum w:abstractNumId="23" w15:restartNumberingAfterBreak="0">
+    <w:nsid w:val="2BC26989"/>
+    <w:multiLevelType w:val="multilevel"/>
+    <w:tmpl w:val="EEB4FA7E"/>
+    <w:lvl w:ilvl="0">
+      <w:start w:val="1"/>
+      <w:numFmt w:val="bullet"/>
+      <w:lvlText w:val=""/>
+      <w:lvlJc w:val="left"/>
+      <w:pPr>
+        <w:tabs>
+          <w:tab w:val="num" w:pos="720"/>
+        </w:tabs>
+        <w:ind w:left="720" w:hanging="360"/>
+      </w:pPr>
+      <w:rPr>
+        <w:rFonts w:ascii="Symbol" w:hAnsi="Symbol" w:hint="default"/>
+        <w:sz w:val="20"/>
+      </w:rPr>
+    </w:lvl>
+    <w:lvl w:ilvl="1" w:tentative="1">
+      <w:start w:val="1"/>
+      <w:numFmt w:val="bullet"/>
+      <w:lvlText w:val="o"/>
+      <w:lvlJc w:val="left"/>
+      <w:pPr>
+        <w:tabs>
+          <w:tab w:val="num" w:pos="1440"/>
+        </w:tabs>
+        <w:ind w:left="1440" w:hanging="360"/>
+      </w:pPr>
+      <w:rPr>
+        <w:rFonts w:ascii="Courier New" w:hAnsi="Courier New" w:hint="default"/>
+        <w:sz w:val="20"/>
+      </w:rPr>
+    </w:lvl>
+    <w:lvl w:ilvl="2" w:tentative="1">
+      <w:start w:val="1"/>
+      <w:numFmt w:val="bullet"/>
+      <w:lvlText w:val=""/>
+      <w:lvlJc w:val="left"/>
+      <w:pPr>
+        <w:tabs>
+          <w:tab w:val="num" w:pos="2160"/>
+        </w:tabs>
+        <w:ind w:left="2160" w:hanging="360"/>
+      </w:pPr>
+      <w:rPr>
+        <w:rFonts w:ascii="Wingdings" w:hAnsi="Wingdings" w:hint="default"/>
+        <w:sz w:val="20"/>
+      </w:rPr>
+    </w:lvl>
+    <w:lvl w:ilvl="3" w:tentative="1">
+      <w:start w:val="1"/>
+      <w:numFmt w:val="bullet"/>
+      <w:lvlText w:val=""/>
+      <w:lvlJc w:val="left"/>
+      <w:pPr>
+        <w:tabs>
+          <w:tab w:val="num" w:pos="2880"/>
+        </w:tabs>
+        <w:ind w:left="2880" w:hanging="360"/>
+      </w:pPr>
+      <w:rPr>
+        <w:rFonts w:ascii="Wingdings" w:hAnsi="Wingdings" w:hint="default"/>
+        <w:sz w:val="20"/>
+      </w:rPr>
+    </w:lvl>
+    <w:lvl w:ilvl="4" w:tentative="1">
+      <w:start w:val="1"/>
+      <w:numFmt w:val="bullet"/>
+      <w:lvlText w:val=""/>
+      <w:lvlJc w:val="left"/>
+      <w:pPr>
+        <w:tabs>
+          <w:tab w:val="num" w:pos="3600"/>
+        </w:tabs>
+        <w:ind w:left="3600" w:hanging="360"/>
+      </w:pPr>
+      <w:rPr>
+        <w:rFonts w:ascii="Wingdings" w:hAnsi="Wingdings" w:hint="default"/>
+        <w:sz w:val="20"/>
+      </w:rPr>
+    </w:lvl>
+    <w:lvl w:ilvl="5" w:tentative="1">
+      <w:start w:val="1"/>
+      <w:numFmt w:val="bullet"/>
+      <w:lvlText w:val=""/>
+      <w:lvlJc w:val="left"/>
+      <w:pPr>
+        <w:tabs>
+          <w:tab w:val="num" w:pos="4320"/>
+        </w:tabs>
+        <w:ind w:left="4320" w:hanging="360"/>
+      </w:pPr>
+      <w:rPr>
+        <w:rFonts w:ascii="Wingdings" w:hAnsi="Wingdings" w:hint="default"/>
+        <w:sz w:val="20"/>
+      </w:rPr>
+    </w:lvl>
+    <w:lvl w:ilvl="6" w:tentative="1">
+      <w:start w:val="1"/>
+      <w:numFmt w:val="bullet"/>
+      <w:lvlText w:val=""/>
+      <w:lvlJc w:val="left"/>
+      <w:pPr>
+        <w:tabs>
+          <w:tab w:val="num" w:pos="5040"/>
+        </w:tabs>
+        <w:ind w:left="5040" w:hanging="360"/>
+      </w:pPr>
+      <w:rPr>
+        <w:rFonts w:ascii="Wingdings" w:hAnsi="Wingdings" w:hint="default"/>
+        <w:sz w:val="20"/>
+      </w:rPr>
+    </w:lvl>
+    <w:lvl w:ilvl="7" w:tentative="1">
+      <w:start w:val="1"/>
+      <w:numFmt w:val="bullet"/>
+      <w:lvlText w:val=""/>
+      <w:lvlJc w:val="left"/>
+      <w:pPr>
+        <w:tabs>
+          <w:tab w:val="num" w:pos="5760"/>
+        </w:tabs>
+        <w:ind w:left="5760" w:hanging="360"/>
+      </w:pPr>
+      <w:rPr>
+        <w:rFonts w:ascii="Wingdings" w:hAnsi="Wingdings" w:hint="default"/>
+        <w:sz w:val="20"/>
+      </w:rPr>
+    </w:lvl>
+    <w:lvl w:ilvl="8" w:tentative="1">
+      <w:start w:val="1"/>
+      <w:numFmt w:val="bullet"/>
+      <w:lvlText w:val=""/>
+      <w:lvlJc w:val="left"/>
+      <w:pPr>
+        <w:tabs>
+          <w:tab w:val="num" w:pos="6480"/>
+        </w:tabs>
+        <w:ind w:left="6480" w:hanging="360"/>
+      </w:pPr>
+      <w:rPr>
+        <w:rFonts w:ascii="Wingdings" w:hAnsi="Wingdings" w:hint="default"/>
+        <w:sz w:val="20"/>
+      </w:rPr>
+    </w:lvl>
+  </w:abstractNum>
+  <w:abstractNum w:abstractNumId="24" w15:restartNumberingAfterBreak="0">
     <w:nsid w:val="2BE822D9"/>
     <w:multiLevelType w:val="multilevel"/>
     <w:tmpl w:val="16AC3214"/>
@@ -4175,7 +5854,7 @@
       </w:rPr>
     </w:lvl>
   </w:abstractNum>
-  <w:abstractNum w:abstractNumId="21" w15:restartNumberingAfterBreak="0">
+  <w:abstractNum w:abstractNumId="25" w15:restartNumberingAfterBreak="0">
     <w:nsid w:val="30AF6A80"/>
     <w:multiLevelType w:val="hybridMultilevel"/>
     <w:tmpl w:val="22A434CE"/>
@@ -4261,7 +5940,7 @@
       </w:pPr>
     </w:lvl>
   </w:abstractNum>
-  <w:abstractNum w:abstractNumId="22" w15:restartNumberingAfterBreak="0">
+  <w:abstractNum w:abstractNumId="26" w15:restartNumberingAfterBreak="0">
     <w:nsid w:val="3E992E26"/>
     <w:multiLevelType w:val="hybridMultilevel"/>
     <w:tmpl w:val="4A94A47C"/>
@@ -4374,7 +6053,7 @@
       </w:rPr>
     </w:lvl>
   </w:abstractNum>
-  <w:abstractNum w:abstractNumId="23" w15:restartNumberingAfterBreak="0">
+  <w:abstractNum w:abstractNumId="27" w15:restartNumberingAfterBreak="0">
     <w:nsid w:val="3EFD37CD"/>
     <w:multiLevelType w:val="hybridMultilevel"/>
     <w:tmpl w:val="22A434CE"/>
@@ -4460,7 +6139,7 @@
       </w:pPr>
     </w:lvl>
   </w:abstractNum>
-  <w:abstractNum w:abstractNumId="24" w15:restartNumberingAfterBreak="0">
+  <w:abstractNum w:abstractNumId="28" w15:restartNumberingAfterBreak="0">
     <w:nsid w:val="402043D5"/>
     <w:multiLevelType w:val="hybridMultilevel"/>
     <w:tmpl w:val="4572A036"/>
@@ -4573,7 +6252,7 @@
       </w:rPr>
     </w:lvl>
   </w:abstractNum>
-  <w:abstractNum w:abstractNumId="25" w15:restartNumberingAfterBreak="0">
+  <w:abstractNum w:abstractNumId="29" w15:restartNumberingAfterBreak="0">
     <w:nsid w:val="46876DE0"/>
     <w:multiLevelType w:val="multilevel"/>
     <w:tmpl w:val="0409001D"/>
@@ -4665,7 +6344,7 @@
       </w:pPr>
     </w:lvl>
   </w:abstractNum>
-  <w:abstractNum w:abstractNumId="26" w15:restartNumberingAfterBreak="0">
+  <w:abstractNum w:abstractNumId="30" w15:restartNumberingAfterBreak="0">
     <w:nsid w:val="48163550"/>
     <w:multiLevelType w:val="hybridMultilevel"/>
     <w:tmpl w:val="22A434CE"/>
@@ -4751,7 +6430,7 @@
       </w:pPr>
     </w:lvl>
   </w:abstractNum>
-  <w:abstractNum w:abstractNumId="27" w15:restartNumberingAfterBreak="0">
+  <w:abstractNum w:abstractNumId="31" w15:restartNumberingAfterBreak="0">
     <w:nsid w:val="487F7EAD"/>
     <w:multiLevelType w:val="hybridMultilevel"/>
     <w:tmpl w:val="3A24C578"/>
@@ -4864,7 +6543,7 @@
       </w:rPr>
     </w:lvl>
   </w:abstractNum>
-  <w:abstractNum w:abstractNumId="28" w15:restartNumberingAfterBreak="0">
+  <w:abstractNum w:abstractNumId="32" w15:restartNumberingAfterBreak="0">
     <w:nsid w:val="4A7C2D9F"/>
     <w:multiLevelType w:val="hybridMultilevel"/>
     <w:tmpl w:val="DCBE2288"/>
@@ -4977,7 +6656,7 @@
       </w:rPr>
     </w:lvl>
   </w:abstractNum>
-  <w:abstractNum w:abstractNumId="29" w15:restartNumberingAfterBreak="0">
+  <w:abstractNum w:abstractNumId="33" w15:restartNumberingAfterBreak="0">
     <w:nsid w:val="4AF54F44"/>
     <w:multiLevelType w:val="hybridMultilevel"/>
     <w:tmpl w:val="3FC60F48"/>
@@ -5090,7 +6769,7 @@
       </w:rPr>
     </w:lvl>
   </w:abstractNum>
-  <w:abstractNum w:abstractNumId="30" w15:restartNumberingAfterBreak="0">
+  <w:abstractNum w:abstractNumId="34" w15:restartNumberingAfterBreak="0">
     <w:nsid w:val="4D255906"/>
     <w:multiLevelType w:val="hybridMultilevel"/>
     <w:tmpl w:val="22A434CE"/>
@@ -5176,7 +6855,7 @@
       </w:pPr>
     </w:lvl>
   </w:abstractNum>
-  <w:abstractNum w:abstractNumId="31" w15:restartNumberingAfterBreak="0">
+  <w:abstractNum w:abstractNumId="35" w15:restartNumberingAfterBreak="0">
     <w:nsid w:val="4E7474A2"/>
     <w:multiLevelType w:val="hybridMultilevel"/>
     <w:tmpl w:val="22A434CE"/>
@@ -5262,7 +6941,156 @@
       </w:pPr>
     </w:lvl>
   </w:abstractNum>
-  <w:abstractNum w:abstractNumId="32" w15:restartNumberingAfterBreak="0">
+  <w:abstractNum w:abstractNumId="36" w15:restartNumberingAfterBreak="0">
+    <w:nsid w:val="512C4CC4"/>
+    <w:multiLevelType w:val="multilevel"/>
+    <w:tmpl w:val="911683B2"/>
+    <w:lvl w:ilvl="0">
+      <w:start w:val="1"/>
+      <w:numFmt w:val="bullet"/>
+      <w:lvlText w:val=""/>
+      <w:lvlJc w:val="left"/>
+      <w:pPr>
+        <w:tabs>
+          <w:tab w:val="num" w:pos="720"/>
+        </w:tabs>
+        <w:ind w:left="720" w:hanging="360"/>
+      </w:pPr>
+      <w:rPr>
+        <w:rFonts w:ascii="Symbol" w:hAnsi="Symbol" w:hint="default"/>
+        <w:sz w:val="20"/>
+      </w:rPr>
+    </w:lvl>
+    <w:lvl w:ilvl="1" w:tentative="1">
+      <w:start w:val="1"/>
+      <w:numFmt w:val="bullet"/>
+      <w:lvlText w:val="o"/>
+      <w:lvlJc w:val="left"/>
+      <w:pPr>
+        <w:tabs>
+          <w:tab w:val="num" w:pos="1440"/>
+        </w:tabs>
+        <w:ind w:left="1440" w:hanging="360"/>
+      </w:pPr>
+      <w:rPr>
+        <w:rFonts w:ascii="Courier New" w:hAnsi="Courier New" w:hint="default"/>
+        <w:sz w:val="20"/>
+      </w:rPr>
+    </w:lvl>
+    <w:lvl w:ilvl="2" w:tentative="1">
+      <w:start w:val="1"/>
+      <w:numFmt w:val="bullet"/>
+      <w:lvlText w:val=""/>
+      <w:lvlJc w:val="left"/>
+      <w:pPr>
+        <w:tabs>
+          <w:tab w:val="num" w:pos="2160"/>
+        </w:tabs>
+        <w:ind w:left="2160" w:hanging="360"/>
+      </w:pPr>
+      <w:rPr>
+        <w:rFonts w:ascii="Wingdings" w:hAnsi="Wingdings" w:hint="default"/>
+        <w:sz w:val="20"/>
+      </w:rPr>
+    </w:lvl>
+    <w:lvl w:ilvl="3" w:tentative="1">
+      <w:start w:val="1"/>
+      <w:numFmt w:val="bullet"/>
+      <w:lvlText w:val=""/>
+      <w:lvlJc w:val="left"/>
+      <w:pPr>
+        <w:tabs>
+          <w:tab w:val="num" w:pos="2880"/>
+        </w:tabs>
+        <w:ind w:left="2880" w:hanging="360"/>
+      </w:pPr>
+      <w:rPr>
+        <w:rFonts w:ascii="Wingdings" w:hAnsi="Wingdings" w:hint="default"/>
+        <w:sz w:val="20"/>
+      </w:rPr>
+    </w:lvl>
+    <w:lvl w:ilvl="4" w:tentative="1">
+      <w:start w:val="1"/>
+      <w:numFmt w:val="bullet"/>
+      <w:lvlText w:val=""/>
+      <w:lvlJc w:val="left"/>
+      <w:pPr>
+        <w:tabs>
+          <w:tab w:val="num" w:pos="3600"/>
+        </w:tabs>
+        <w:ind w:left="3600" w:hanging="360"/>
+      </w:pPr>
+      <w:rPr>
+        <w:rFonts w:ascii="Wingdings" w:hAnsi="Wingdings" w:hint="default"/>
+        <w:sz w:val="20"/>
+      </w:rPr>
+    </w:lvl>
+    <w:lvl w:ilvl="5" w:tentative="1">
+      <w:start w:val="1"/>
+      <w:numFmt w:val="bullet"/>
+      <w:lvlText w:val=""/>
+      <w:lvlJc w:val="left"/>
+      <w:pPr>
+        <w:tabs>
+          <w:tab w:val="num" w:pos="4320"/>
+        </w:tabs>
+        <w:ind w:left="4320" w:hanging="360"/>
+      </w:pPr>
+      <w:rPr>
+        <w:rFonts w:ascii="Wingdings" w:hAnsi="Wingdings" w:hint="default"/>
+        <w:sz w:val="20"/>
+      </w:rPr>
+    </w:lvl>
+    <w:lvl w:ilvl="6" w:tentative="1">
+      <w:start w:val="1"/>
+      <w:numFmt w:val="bullet"/>
+      <w:lvlText w:val=""/>
+      <w:lvlJc w:val="left"/>
+      <w:pPr>
+        <w:tabs>
+          <w:tab w:val="num" w:pos="5040"/>
+        </w:tabs>
+        <w:ind w:left="5040" w:hanging="360"/>
+      </w:pPr>
+      <w:rPr>
+        <w:rFonts w:ascii="Wingdings" w:hAnsi="Wingdings" w:hint="default"/>
+        <w:sz w:val="20"/>
+      </w:rPr>
+    </w:lvl>
+    <w:lvl w:ilvl="7" w:tentative="1">
+      <w:start w:val="1"/>
+      <w:numFmt w:val="bullet"/>
+      <w:lvlText w:val=""/>
+      <w:lvlJc w:val="left"/>
+      <w:pPr>
+        <w:tabs>
+          <w:tab w:val="num" w:pos="5760"/>
+        </w:tabs>
+        <w:ind w:left="5760" w:hanging="360"/>
+      </w:pPr>
+      <w:rPr>
+        <w:rFonts w:ascii="Wingdings" w:hAnsi="Wingdings" w:hint="default"/>
+        <w:sz w:val="20"/>
+      </w:rPr>
+    </w:lvl>
+    <w:lvl w:ilvl="8" w:tentative="1">
+      <w:start w:val="1"/>
+      <w:numFmt w:val="bullet"/>
+      <w:lvlText w:val=""/>
+      <w:lvlJc w:val="left"/>
+      <w:pPr>
+        <w:tabs>
+          <w:tab w:val="num" w:pos="6480"/>
+        </w:tabs>
+        <w:ind w:left="6480" w:hanging="360"/>
+      </w:pPr>
+      <w:rPr>
+        <w:rFonts w:ascii="Wingdings" w:hAnsi="Wingdings" w:hint="default"/>
+        <w:sz w:val="20"/>
+      </w:rPr>
+    </w:lvl>
+  </w:abstractNum>
+  <w:abstractNum w:abstractNumId="37" w15:restartNumberingAfterBreak="0">
     <w:nsid w:val="52321C48"/>
     <w:multiLevelType w:val="hybridMultilevel"/>
     <w:tmpl w:val="22A434CE"/>
@@ -5348,7 +7176,7 @@
       </w:pPr>
     </w:lvl>
   </w:abstractNum>
-  <w:abstractNum w:abstractNumId="33" w15:restartNumberingAfterBreak="0">
+  <w:abstractNum w:abstractNumId="38" w15:restartNumberingAfterBreak="0">
     <w:nsid w:val="52915BC5"/>
     <w:multiLevelType w:val="hybridMultilevel"/>
     <w:tmpl w:val="C8D89004"/>
@@ -5461,7 +7289,7 @@
       </w:rPr>
     </w:lvl>
   </w:abstractNum>
-  <w:abstractNum w:abstractNumId="34" w15:restartNumberingAfterBreak="0">
+  <w:abstractNum w:abstractNumId="39" w15:restartNumberingAfterBreak="0">
     <w:nsid w:val="52DC0EA7"/>
     <w:multiLevelType w:val="hybridMultilevel"/>
     <w:tmpl w:val="C860A87E"/>
@@ -5574,7 +7402,156 @@
       </w:rPr>
     </w:lvl>
   </w:abstractNum>
-  <w:abstractNum w:abstractNumId="35" w15:restartNumberingAfterBreak="0">
+  <w:abstractNum w:abstractNumId="40" w15:restartNumberingAfterBreak="0">
+    <w:nsid w:val="54452D08"/>
+    <w:multiLevelType w:val="multilevel"/>
+    <w:tmpl w:val="B37AE812"/>
+    <w:lvl w:ilvl="0">
+      <w:start w:val="1"/>
+      <w:numFmt w:val="bullet"/>
+      <w:lvlText w:val=""/>
+      <w:lvlJc w:val="left"/>
+      <w:pPr>
+        <w:tabs>
+          <w:tab w:val="num" w:pos="720"/>
+        </w:tabs>
+        <w:ind w:left="720" w:hanging="360"/>
+      </w:pPr>
+      <w:rPr>
+        <w:rFonts w:ascii="Symbol" w:hAnsi="Symbol" w:hint="default"/>
+        <w:sz w:val="20"/>
+      </w:rPr>
+    </w:lvl>
+    <w:lvl w:ilvl="1" w:tentative="1">
+      <w:start w:val="1"/>
+      <w:numFmt w:val="bullet"/>
+      <w:lvlText w:val="o"/>
+      <w:lvlJc w:val="left"/>
+      <w:pPr>
+        <w:tabs>
+          <w:tab w:val="num" w:pos="1440"/>
+        </w:tabs>
+        <w:ind w:left="1440" w:hanging="360"/>
+      </w:pPr>
+      <w:rPr>
+        <w:rFonts w:ascii="Courier New" w:hAnsi="Courier New" w:hint="default"/>
+        <w:sz w:val="20"/>
+      </w:rPr>
+    </w:lvl>
+    <w:lvl w:ilvl="2" w:tentative="1">
+      <w:start w:val="1"/>
+      <w:numFmt w:val="bullet"/>
+      <w:lvlText w:val=""/>
+      <w:lvlJc w:val="left"/>
+      <w:pPr>
+        <w:tabs>
+          <w:tab w:val="num" w:pos="2160"/>
+        </w:tabs>
+        <w:ind w:left="2160" w:hanging="360"/>
+      </w:pPr>
+      <w:rPr>
+        <w:rFonts w:ascii="Wingdings" w:hAnsi="Wingdings" w:hint="default"/>
+        <w:sz w:val="20"/>
+      </w:rPr>
+    </w:lvl>
+    <w:lvl w:ilvl="3" w:tentative="1">
+      <w:start w:val="1"/>
+      <w:numFmt w:val="bullet"/>
+      <w:lvlText w:val=""/>
+      <w:lvlJc w:val="left"/>
+      <w:pPr>
+        <w:tabs>
+          <w:tab w:val="num" w:pos="2880"/>
+        </w:tabs>
+        <w:ind w:left="2880" w:hanging="360"/>
+      </w:pPr>
+      <w:rPr>
+        <w:rFonts w:ascii="Wingdings" w:hAnsi="Wingdings" w:hint="default"/>
+        <w:sz w:val="20"/>
+      </w:rPr>
+    </w:lvl>
+    <w:lvl w:ilvl="4" w:tentative="1">
+      <w:start w:val="1"/>
+      <w:numFmt w:val="bullet"/>
+      <w:lvlText w:val=""/>
+      <w:lvlJc w:val="left"/>
+      <w:pPr>
+        <w:tabs>
+          <w:tab w:val="num" w:pos="3600"/>
+        </w:tabs>
+        <w:ind w:left="3600" w:hanging="360"/>
+      </w:pPr>
+      <w:rPr>
+        <w:rFonts w:ascii="Wingdings" w:hAnsi="Wingdings" w:hint="default"/>
+        <w:sz w:val="20"/>
+      </w:rPr>
+    </w:lvl>
+    <w:lvl w:ilvl="5" w:tentative="1">
+      <w:start w:val="1"/>
+      <w:numFmt w:val="bullet"/>
+      <w:lvlText w:val=""/>
+      <w:lvlJc w:val="left"/>
+      <w:pPr>
+        <w:tabs>
+          <w:tab w:val="num" w:pos="4320"/>
+        </w:tabs>
+        <w:ind w:left="4320" w:hanging="360"/>
+      </w:pPr>
+      <w:rPr>
+        <w:rFonts w:ascii="Wingdings" w:hAnsi="Wingdings" w:hint="default"/>
+        <w:sz w:val="20"/>
+      </w:rPr>
+    </w:lvl>
+    <w:lvl w:ilvl="6" w:tentative="1">
+      <w:start w:val="1"/>
+      <w:numFmt w:val="bullet"/>
+      <w:lvlText w:val=""/>
+      <w:lvlJc w:val="left"/>
+      <w:pPr>
+        <w:tabs>
+          <w:tab w:val="num" w:pos="5040"/>
+        </w:tabs>
+        <w:ind w:left="5040" w:hanging="360"/>
+      </w:pPr>
+      <w:rPr>
+        <w:rFonts w:ascii="Wingdings" w:hAnsi="Wingdings" w:hint="default"/>
+        <w:sz w:val="20"/>
+      </w:rPr>
+    </w:lvl>
+    <w:lvl w:ilvl="7" w:tentative="1">
+      <w:start w:val="1"/>
+      <w:numFmt w:val="bullet"/>
+      <w:lvlText w:val=""/>
+      <w:lvlJc w:val="left"/>
+      <w:pPr>
+        <w:tabs>
+          <w:tab w:val="num" w:pos="5760"/>
+        </w:tabs>
+        <w:ind w:left="5760" w:hanging="360"/>
+      </w:pPr>
+      <w:rPr>
+        <w:rFonts w:ascii="Wingdings" w:hAnsi="Wingdings" w:hint="default"/>
+        <w:sz w:val="20"/>
+      </w:rPr>
+    </w:lvl>
+    <w:lvl w:ilvl="8" w:tentative="1">
+      <w:start w:val="1"/>
+      <w:numFmt w:val="bullet"/>
+      <w:lvlText w:val=""/>
+      <w:lvlJc w:val="left"/>
+      <w:pPr>
+        <w:tabs>
+          <w:tab w:val="num" w:pos="6480"/>
+        </w:tabs>
+        <w:ind w:left="6480" w:hanging="360"/>
+      </w:pPr>
+      <w:rPr>
+        <w:rFonts w:ascii="Wingdings" w:hAnsi="Wingdings" w:hint="default"/>
+        <w:sz w:val="20"/>
+      </w:rPr>
+    </w:lvl>
+  </w:abstractNum>
+  <w:abstractNum w:abstractNumId="41" w15:restartNumberingAfterBreak="0">
     <w:nsid w:val="55EA46DA"/>
     <w:multiLevelType w:val="hybridMultilevel"/>
     <w:tmpl w:val="22A434CE"/>
@@ -5660,7 +7637,7 @@
       </w:pPr>
     </w:lvl>
   </w:abstractNum>
-  <w:abstractNum w:abstractNumId="36" w15:restartNumberingAfterBreak="0">
+  <w:abstractNum w:abstractNumId="42" w15:restartNumberingAfterBreak="0">
     <w:nsid w:val="59E030C7"/>
     <w:multiLevelType w:val="hybridMultilevel"/>
     <w:tmpl w:val="22A434CE"/>
@@ -5746,7 +7723,7 @@
       </w:pPr>
     </w:lvl>
   </w:abstractNum>
-  <w:abstractNum w:abstractNumId="37" w15:restartNumberingAfterBreak="0">
+  <w:abstractNum w:abstractNumId="43" w15:restartNumberingAfterBreak="0">
     <w:nsid w:val="59F558C8"/>
     <w:multiLevelType w:val="hybridMultilevel"/>
     <w:tmpl w:val="22A434CE"/>
@@ -5832,7 +7809,7 @@
       </w:pPr>
     </w:lvl>
   </w:abstractNum>
-  <w:abstractNum w:abstractNumId="38" w15:restartNumberingAfterBreak="0">
+  <w:abstractNum w:abstractNumId="44" w15:restartNumberingAfterBreak="0">
     <w:nsid w:val="5B2A2792"/>
     <w:multiLevelType w:val="hybridMultilevel"/>
     <w:tmpl w:val="198A03BC"/>
@@ -5945,7 +7922,7 @@
       </w:rPr>
     </w:lvl>
   </w:abstractNum>
-  <w:abstractNum w:abstractNumId="39" w15:restartNumberingAfterBreak="0">
+  <w:abstractNum w:abstractNumId="45" w15:restartNumberingAfterBreak="0">
     <w:nsid w:val="5F3428D4"/>
     <w:multiLevelType w:val="hybridMultilevel"/>
     <w:tmpl w:val="2A2E9144"/>
@@ -6058,7 +8035,7 @@
       </w:rPr>
     </w:lvl>
   </w:abstractNum>
-  <w:abstractNum w:abstractNumId="40" w15:restartNumberingAfterBreak="0">
+  <w:abstractNum w:abstractNumId="46" w15:restartNumberingAfterBreak="0">
     <w:nsid w:val="60A67B6A"/>
     <w:multiLevelType w:val="multilevel"/>
     <w:tmpl w:val="F4C6E26A"/>
@@ -6207,7 +8184,7 @@
       </w:rPr>
     </w:lvl>
   </w:abstractNum>
-  <w:abstractNum w:abstractNumId="41" w15:restartNumberingAfterBreak="0">
+  <w:abstractNum w:abstractNumId="47" w15:restartNumberingAfterBreak="0">
     <w:nsid w:val="69076F25"/>
     <w:multiLevelType w:val="hybridMultilevel"/>
     <w:tmpl w:val="13364214"/>
@@ -6320,7 +8297,7 @@
       </w:rPr>
     </w:lvl>
   </w:abstractNum>
-  <w:abstractNum w:abstractNumId="42" w15:restartNumberingAfterBreak="0">
+  <w:abstractNum w:abstractNumId="48" w15:restartNumberingAfterBreak="0">
     <w:nsid w:val="6A9E6AD3"/>
     <w:multiLevelType w:val="multilevel"/>
     <w:tmpl w:val="0409001D"/>
@@ -6407,7 +8384,7 @@
       </w:pPr>
     </w:lvl>
   </w:abstractNum>
-  <w:abstractNum w:abstractNumId="43" w15:restartNumberingAfterBreak="0">
+  <w:abstractNum w:abstractNumId="49" w15:restartNumberingAfterBreak="0">
     <w:nsid w:val="6E102466"/>
     <w:multiLevelType w:val="hybridMultilevel"/>
     <w:tmpl w:val="3972468E"/>
@@ -6520,7 +8497,156 @@
       </w:rPr>
     </w:lvl>
   </w:abstractNum>
-  <w:abstractNum w:abstractNumId="44" w15:restartNumberingAfterBreak="0">
+  <w:abstractNum w:abstractNumId="50" w15:restartNumberingAfterBreak="0">
+    <w:nsid w:val="70EC5DED"/>
+    <w:multiLevelType w:val="multilevel"/>
+    <w:tmpl w:val="0B5E6F40"/>
+    <w:lvl w:ilvl="0">
+      <w:start w:val="1"/>
+      <w:numFmt w:val="bullet"/>
+      <w:lvlText w:val=""/>
+      <w:lvlJc w:val="left"/>
+      <w:pPr>
+        <w:tabs>
+          <w:tab w:val="num" w:pos="720"/>
+        </w:tabs>
+        <w:ind w:left="720" w:hanging="360"/>
+      </w:pPr>
+      <w:rPr>
+        <w:rFonts w:ascii="Symbol" w:hAnsi="Symbol" w:hint="default"/>
+        <w:sz w:val="20"/>
+      </w:rPr>
+    </w:lvl>
+    <w:lvl w:ilvl="1" w:tentative="1">
+      <w:start w:val="1"/>
+      <w:numFmt w:val="bullet"/>
+      <w:lvlText w:val="o"/>
+      <w:lvlJc w:val="left"/>
+      <w:pPr>
+        <w:tabs>
+          <w:tab w:val="num" w:pos="1440"/>
+        </w:tabs>
+        <w:ind w:left="1440" w:hanging="360"/>
+      </w:pPr>
+      <w:rPr>
+        <w:rFonts w:ascii="Courier New" w:hAnsi="Courier New" w:hint="default"/>
+        <w:sz w:val="20"/>
+      </w:rPr>
+    </w:lvl>
+    <w:lvl w:ilvl="2" w:tentative="1">
+      <w:start w:val="1"/>
+      <w:numFmt w:val="bullet"/>
+      <w:lvlText w:val=""/>
+      <w:lvlJc w:val="left"/>
+      <w:pPr>
+        <w:tabs>
+          <w:tab w:val="num" w:pos="2160"/>
+        </w:tabs>
+        <w:ind w:left="2160" w:hanging="360"/>
+      </w:pPr>
+      <w:rPr>
+        <w:rFonts w:ascii="Wingdings" w:hAnsi="Wingdings" w:hint="default"/>
+        <w:sz w:val="20"/>
+      </w:rPr>
+    </w:lvl>
+    <w:lvl w:ilvl="3" w:tentative="1">
+      <w:start w:val="1"/>
+      <w:numFmt w:val="bullet"/>
+      <w:lvlText w:val=""/>
+      <w:lvlJc w:val="left"/>
+      <w:pPr>
+        <w:tabs>
+          <w:tab w:val="num" w:pos="2880"/>
+        </w:tabs>
+        <w:ind w:left="2880" w:hanging="360"/>
+      </w:pPr>
+      <w:rPr>
+        <w:rFonts w:ascii="Wingdings" w:hAnsi="Wingdings" w:hint="default"/>
+        <w:sz w:val="20"/>
+      </w:rPr>
+    </w:lvl>
+    <w:lvl w:ilvl="4" w:tentative="1">
+      <w:start w:val="1"/>
+      <w:numFmt w:val="bullet"/>
+      <w:lvlText w:val=""/>
+      <w:lvlJc w:val="left"/>
+      <w:pPr>
+        <w:tabs>
+          <w:tab w:val="num" w:pos="3600"/>
+        </w:tabs>
+        <w:ind w:left="3600" w:hanging="360"/>
+      </w:pPr>
+      <w:rPr>
+        <w:rFonts w:ascii="Wingdings" w:hAnsi="Wingdings" w:hint="default"/>
+        <w:sz w:val="20"/>
+      </w:rPr>
+    </w:lvl>
+    <w:lvl w:ilvl="5" w:tentative="1">
+      <w:start w:val="1"/>
+      <w:numFmt w:val="bullet"/>
+      <w:lvlText w:val=""/>
+      <w:lvlJc w:val="left"/>
+      <w:pPr>
+        <w:tabs>
+          <w:tab w:val="num" w:pos="4320"/>
+        </w:tabs>
+        <w:ind w:left="4320" w:hanging="360"/>
+      </w:pPr>
+      <w:rPr>
+        <w:rFonts w:ascii="Wingdings" w:hAnsi="Wingdings" w:hint="default"/>
+        <w:sz w:val="20"/>
+      </w:rPr>
+    </w:lvl>
+    <w:lvl w:ilvl="6" w:tentative="1">
+      <w:start w:val="1"/>
+      <w:numFmt w:val="bullet"/>
+      <w:lvlText w:val=""/>
+      <w:lvlJc w:val="left"/>
+      <w:pPr>
+        <w:tabs>
+          <w:tab w:val="num" w:pos="5040"/>
+        </w:tabs>
+        <w:ind w:left="5040" w:hanging="360"/>
+      </w:pPr>
+      <w:rPr>
+        <w:rFonts w:ascii="Wingdings" w:hAnsi="Wingdings" w:hint="default"/>
+        <w:sz w:val="20"/>
+      </w:rPr>
+    </w:lvl>
+    <w:lvl w:ilvl="7" w:tentative="1">
+      <w:start w:val="1"/>
+      <w:numFmt w:val="bullet"/>
+      <w:lvlText w:val=""/>
+      <w:lvlJc w:val="left"/>
+      <w:pPr>
+        <w:tabs>
+          <w:tab w:val="num" w:pos="5760"/>
+        </w:tabs>
+        <w:ind w:left="5760" w:hanging="360"/>
+      </w:pPr>
+      <w:rPr>
+        <w:rFonts w:ascii="Wingdings" w:hAnsi="Wingdings" w:hint="default"/>
+        <w:sz w:val="20"/>
+      </w:rPr>
+    </w:lvl>
+    <w:lvl w:ilvl="8" w:tentative="1">
+      <w:start w:val="1"/>
+      <w:numFmt w:val="bullet"/>
+      <w:lvlText w:val=""/>
+      <w:lvlJc w:val="left"/>
+      <w:pPr>
+        <w:tabs>
+          <w:tab w:val="num" w:pos="6480"/>
+        </w:tabs>
+        <w:ind w:left="6480" w:hanging="360"/>
+      </w:pPr>
+      <w:rPr>
+        <w:rFonts w:ascii="Wingdings" w:hAnsi="Wingdings" w:hint="default"/>
+        <w:sz w:val="20"/>
+      </w:rPr>
+    </w:lvl>
+  </w:abstractNum>
+  <w:abstractNum w:abstractNumId="51" w15:restartNumberingAfterBreak="0">
     <w:nsid w:val="7301425B"/>
     <w:multiLevelType w:val="hybridMultilevel"/>
     <w:tmpl w:val="22A434CE"/>
@@ -6606,7 +8732,7 @@
       </w:pPr>
     </w:lvl>
   </w:abstractNum>
-  <w:abstractNum w:abstractNumId="45" w15:restartNumberingAfterBreak="0">
+  <w:abstractNum w:abstractNumId="52" w15:restartNumberingAfterBreak="0">
     <w:nsid w:val="730E1E21"/>
     <w:multiLevelType w:val="hybridMultilevel"/>
     <w:tmpl w:val="8FA66106"/>
@@ -6719,7 +8845,7 @@
       </w:rPr>
     </w:lvl>
   </w:abstractNum>
-  <w:abstractNum w:abstractNumId="46" w15:restartNumberingAfterBreak="0">
+  <w:abstractNum w:abstractNumId="53" w15:restartNumberingAfterBreak="0">
     <w:nsid w:val="737806F4"/>
     <w:multiLevelType w:val="hybridMultilevel"/>
     <w:tmpl w:val="22A434CE"/>
@@ -6805,7 +8931,7 @@
       </w:pPr>
     </w:lvl>
   </w:abstractNum>
-  <w:abstractNum w:abstractNumId="47" w15:restartNumberingAfterBreak="0">
+  <w:abstractNum w:abstractNumId="54" w15:restartNumberingAfterBreak="0">
     <w:nsid w:val="76D51CCF"/>
     <w:multiLevelType w:val="multilevel"/>
     <w:tmpl w:val="7B2830F4"/>
@@ -6941,7 +9067,7 @@
       </w:rPr>
     </w:lvl>
   </w:abstractNum>
-  <w:abstractNum w:abstractNumId="48" w15:restartNumberingAfterBreak="0">
+  <w:abstractNum w:abstractNumId="55" w15:restartNumberingAfterBreak="0">
     <w:nsid w:val="79A8028F"/>
     <w:multiLevelType w:val="hybridMultilevel"/>
     <w:tmpl w:val="4FDC1F34"/>
@@ -7055,151 +9181,172 @@
     </w:lvl>
   </w:abstractNum>
   <w:num w:numId="1" w16cid:durableId="1157377987">
+    <w:abstractNumId w:val="54"/>
+  </w:num>
+  <w:num w:numId="2" w16cid:durableId="1619877159">
+    <w:abstractNumId w:val="48"/>
+  </w:num>
+  <w:num w:numId="3" w16cid:durableId="1497185041">
+    <w:abstractNumId w:val="29"/>
+  </w:num>
+  <w:num w:numId="4" w16cid:durableId="1584953634">
+    <w:abstractNumId w:val="11"/>
+  </w:num>
+  <w:num w:numId="5" w16cid:durableId="1454061009">
+    <w:abstractNumId w:val="31"/>
+  </w:num>
+  <w:num w:numId="6" w16cid:durableId="1517887663">
+    <w:abstractNumId w:val="5"/>
+  </w:num>
+  <w:num w:numId="7" w16cid:durableId="880753270">
+    <w:abstractNumId w:val="10"/>
+  </w:num>
+  <w:num w:numId="8" w16cid:durableId="1896774456">
     <w:abstractNumId w:val="47"/>
   </w:num>
-  <w:num w:numId="2" w16cid:durableId="1619877159">
-    <w:abstractNumId w:val="42"/>
-  </w:num>
-  <w:num w:numId="3" w16cid:durableId="1497185041">
-    <w:abstractNumId w:val="25"/>
-  </w:num>
-  <w:num w:numId="4" w16cid:durableId="1584953634">
-    <w:abstractNumId w:val="10"/>
-  </w:num>
-  <w:num w:numId="5" w16cid:durableId="1454061009">
-    <w:abstractNumId w:val="27"/>
-  </w:num>
-  <w:num w:numId="6" w16cid:durableId="1517887663">
-    <w:abstractNumId w:val="4"/>
-  </w:num>
-  <w:num w:numId="7" w16cid:durableId="880753270">
-    <w:abstractNumId w:val="9"/>
-  </w:num>
-  <w:num w:numId="8" w16cid:durableId="1896774456">
-    <w:abstractNumId w:val="41"/>
-  </w:num>
   <w:num w:numId="9" w16cid:durableId="1013797383">
-    <w:abstractNumId w:val="13"/>
+    <w:abstractNumId w:val="14"/>
   </w:num>
   <w:num w:numId="10" w16cid:durableId="1439181207">
-    <w:abstractNumId w:val="28"/>
+    <w:abstractNumId w:val="32"/>
   </w:num>
   <w:num w:numId="11" w16cid:durableId="1642732469">
-    <w:abstractNumId w:val="19"/>
+    <w:abstractNumId w:val="22"/>
   </w:num>
   <w:num w:numId="12" w16cid:durableId="1245187927">
-    <w:abstractNumId w:val="24"/>
+    <w:abstractNumId w:val="28"/>
   </w:num>
   <w:num w:numId="13" w16cid:durableId="1326737201">
     <w:abstractNumId w:val="3"/>
   </w:num>
   <w:num w:numId="14" w16cid:durableId="551504171">
-    <w:abstractNumId w:val="22"/>
+    <w:abstractNumId w:val="26"/>
   </w:num>
   <w:num w:numId="15" w16cid:durableId="560361659">
-    <w:abstractNumId w:val="12"/>
+    <w:abstractNumId w:val="13"/>
   </w:num>
   <w:num w:numId="16" w16cid:durableId="1944604981">
-    <w:abstractNumId w:val="18"/>
+    <w:abstractNumId w:val="21"/>
   </w:num>
   <w:num w:numId="17" w16cid:durableId="1714304419">
+    <w:abstractNumId w:val="45"/>
+  </w:num>
+  <w:num w:numId="18" w16cid:durableId="1842814489">
     <w:abstractNumId w:val="39"/>
   </w:num>
-  <w:num w:numId="18" w16cid:durableId="1842814489">
-    <w:abstractNumId w:val="34"/>
-  </w:num>
   <w:num w:numId="19" w16cid:durableId="924462282">
-    <w:abstractNumId w:val="8"/>
+    <w:abstractNumId w:val="9"/>
   </w:num>
   <w:num w:numId="20" w16cid:durableId="1590457664">
-    <w:abstractNumId w:val="48"/>
+    <w:abstractNumId w:val="55"/>
   </w:num>
   <w:num w:numId="21" w16cid:durableId="829364903">
-    <w:abstractNumId w:val="29"/>
+    <w:abstractNumId w:val="33"/>
   </w:num>
   <w:num w:numId="22" w16cid:durableId="2130120374">
-    <w:abstractNumId w:val="40"/>
+    <w:abstractNumId w:val="46"/>
   </w:num>
   <w:num w:numId="23" w16cid:durableId="1891109955">
     <w:abstractNumId w:val="0"/>
   </w:num>
   <w:num w:numId="24" w16cid:durableId="828710996">
-    <w:abstractNumId w:val="15"/>
+    <w:abstractNumId w:val="17"/>
   </w:num>
   <w:num w:numId="25" w16cid:durableId="2129426044">
-    <w:abstractNumId w:val="33"/>
+    <w:abstractNumId w:val="38"/>
   </w:num>
   <w:num w:numId="26" w16cid:durableId="1935165634">
-    <w:abstractNumId w:val="45"/>
+    <w:abstractNumId w:val="52"/>
   </w:num>
   <w:num w:numId="27" w16cid:durableId="732309913">
+    <w:abstractNumId w:val="18"/>
+  </w:num>
+  <w:num w:numId="28" w16cid:durableId="1786073229">
+    <w:abstractNumId w:val="49"/>
+  </w:num>
+  <w:num w:numId="29" w16cid:durableId="349139408">
+    <w:abstractNumId w:val="12"/>
+  </w:num>
+  <w:num w:numId="30" w16cid:durableId="193619159">
     <w:abstractNumId w:val="16"/>
   </w:num>
-  <w:num w:numId="28" w16cid:durableId="1786073229">
-    <w:abstractNumId w:val="43"/>
-  </w:num>
-  <w:num w:numId="29" w16cid:durableId="349139408">
-    <w:abstractNumId w:val="11"/>
-  </w:num>
-  <w:num w:numId="30" w16cid:durableId="193619159">
-    <w:abstractNumId w:val="14"/>
-  </w:num>
   <w:num w:numId="31" w16cid:durableId="959993755">
-    <w:abstractNumId w:val="21"/>
+    <w:abstractNumId w:val="25"/>
   </w:num>
   <w:num w:numId="32" w16cid:durableId="1624848671">
-    <w:abstractNumId w:val="17"/>
+    <w:abstractNumId w:val="20"/>
   </w:num>
   <w:num w:numId="33" w16cid:durableId="1663698192">
-    <w:abstractNumId w:val="46"/>
+    <w:abstractNumId w:val="53"/>
   </w:num>
   <w:num w:numId="34" w16cid:durableId="1741057160">
-    <w:abstractNumId w:val="23"/>
+    <w:abstractNumId w:val="27"/>
   </w:num>
   <w:num w:numId="35" w16cid:durableId="843711336">
-    <w:abstractNumId w:val="38"/>
+    <w:abstractNumId w:val="44"/>
   </w:num>
   <w:num w:numId="36" w16cid:durableId="1950089738">
-    <w:abstractNumId w:val="30"/>
+    <w:abstractNumId w:val="34"/>
   </w:num>
   <w:num w:numId="37" w16cid:durableId="1026760909">
-    <w:abstractNumId w:val="37"/>
+    <w:abstractNumId w:val="43"/>
   </w:num>
   <w:num w:numId="38" w16cid:durableId="1546986350">
     <w:abstractNumId w:val="1"/>
   </w:num>
   <w:num w:numId="39" w16cid:durableId="61146097">
-    <w:abstractNumId w:val="36"/>
+    <w:abstractNumId w:val="42"/>
   </w:num>
   <w:num w:numId="40" w16cid:durableId="1361858169">
+    <w:abstractNumId w:val="41"/>
+  </w:num>
+  <w:num w:numId="41" w16cid:durableId="1773083844">
+    <w:abstractNumId w:val="30"/>
+  </w:num>
+  <w:num w:numId="42" w16cid:durableId="1086464276">
     <w:abstractNumId w:val="35"/>
   </w:num>
-  <w:num w:numId="41" w16cid:durableId="1773083844">
-    <w:abstractNumId w:val="26"/>
-  </w:num>
-  <w:num w:numId="42" w16cid:durableId="1086464276">
-    <w:abstractNumId w:val="31"/>
-  </w:num>
   <w:num w:numId="43" w16cid:durableId="105203410">
-    <w:abstractNumId w:val="6"/>
+    <w:abstractNumId w:val="7"/>
   </w:num>
   <w:num w:numId="44" w16cid:durableId="481511447">
-    <w:abstractNumId w:val="7"/>
+    <w:abstractNumId w:val="8"/>
   </w:num>
   <w:num w:numId="45" w16cid:durableId="1362122760">
-    <w:abstractNumId w:val="44"/>
+    <w:abstractNumId w:val="51"/>
   </w:num>
   <w:num w:numId="46" w16cid:durableId="667825877">
-    <w:abstractNumId w:val="32"/>
+    <w:abstractNumId w:val="37"/>
   </w:num>
   <w:num w:numId="47" w16cid:durableId="1492406249">
     <w:abstractNumId w:val="2"/>
   </w:num>
   <w:num w:numId="48" w16cid:durableId="1277787147">
-    <w:abstractNumId w:val="20"/>
+    <w:abstractNumId w:val="24"/>
   </w:num>
   <w:num w:numId="49" w16cid:durableId="1365516583">
-    <w:abstractNumId w:val="5"/>
+    <w:abstractNumId w:val="6"/>
+  </w:num>
+  <w:num w:numId="50" w16cid:durableId="1102728108">
+    <w:abstractNumId w:val="40"/>
+  </w:num>
+  <w:num w:numId="51" w16cid:durableId="1984114099">
+    <w:abstractNumId w:val="36"/>
+  </w:num>
+  <w:num w:numId="52" w16cid:durableId="972057378">
+    <w:abstractNumId w:val="19"/>
+  </w:num>
+  <w:num w:numId="53" w16cid:durableId="948657171">
+    <w:abstractNumId w:val="50"/>
+  </w:num>
+  <w:num w:numId="54" w16cid:durableId="1416708396">
+    <w:abstractNumId w:val="4"/>
+  </w:num>
+  <w:num w:numId="55" w16cid:durableId="966088409">
+    <w:abstractNumId w:val="23"/>
+  </w:num>
+  <w:num w:numId="56" w16cid:durableId="648676571">
+    <w:abstractNumId w:val="15"/>
   </w:num>
   <w:numIdMacAtCleanup w:val="47"/>
 </w:numbering>

</xml_diff>